<commit_message>
updated screenshots for Task 1
</commit_message>
<xml_diff>
--- a/Course Docs/BSCNE Capstone Functionality Report.docx
+++ b/Course Docs/BSCNE Capstone Functionality Report.docx
@@ -360,6 +360,14 @@
               </w:rPr>
               <w:t> </w:t>
             </w:r>
+            <w:r>
+              <w:rPr>
+                <w:rFonts w:ascii="Verdana" w:eastAsia="Times New Roman" w:hAnsi="Verdana" w:cs="Times New Roman"/>
+                <w:sz w:val="20"/>
+                <w:szCs w:val="20"/>
+              </w:rPr>
+              <w:t>Christopher Matti</w:t>
+            </w:r>
           </w:p>
         </w:tc>
       </w:tr>
@@ -434,6 +442,14 @@
                 <w:szCs w:val="20"/>
               </w:rPr>
               <w:t> </w:t>
+            </w:r>
+            <w:r>
+              <w:rPr>
+                <w:rFonts w:ascii="Verdana" w:eastAsia="Times New Roman" w:hAnsi="Verdana" w:cs="Times New Roman"/>
+                <w:sz w:val="20"/>
+                <w:szCs w:val="20"/>
+              </w:rPr>
+              <w:t>011836844</w:t>
             </w:r>
           </w:p>
         </w:tc>
@@ -510,6 +526,14 @@
               </w:rPr>
               <w:t> </w:t>
             </w:r>
+            <w:r>
+              <w:rPr>
+                <w:rFonts w:ascii="Verdana" w:eastAsia="Times New Roman" w:hAnsi="Verdana" w:cs="Times New Roman"/>
+                <w:sz w:val="20"/>
+                <w:szCs w:val="20"/>
+              </w:rPr>
+              <w:t>cmatti@wgu.edu</w:t>
+            </w:r>
           </w:p>
         </w:tc>
       </w:tr>
@@ -2016,6 +2040,7 @@
       <w:r>
         <w:rPr>
           <w:rFonts w:ascii="Verdana" w:eastAsia="Times New Roman" w:hAnsi="Verdana" w:cs="Segoe UI"/>
+          <w:noProof/>
           <w:sz w:val="18"/>
           <w:szCs w:val="18"/>
         </w:rPr>
@@ -2072,6 +2097,9 @@
     </w:p>
     <w:p>
       <w:r>
+        <w:rPr>
+          <w:noProof/>
+        </w:rPr>
         <w:drawing>
           <wp:inline distT="0" distB="0" distL="0" distR="0" wp14:anchorId="6FF13728" wp14:editId="07FFEB08">
             <wp:extent cx="5943600" cy="3192145"/>
@@ -2111,6 +2139,9 @@
     </w:p>
     <w:p>
       <w:r>
+        <w:rPr>
+          <w:noProof/>
+        </w:rPr>
         <w:drawing>
           <wp:inline distT="0" distB="0" distL="0" distR="0" wp14:anchorId="504E1C9A" wp14:editId="28990A2B">
             <wp:extent cx="5943600" cy="1858010"/>
@@ -2150,6 +2181,9 @@
     </w:p>
     <w:p>
       <w:r>
+        <w:rPr>
+          <w:noProof/>
+        </w:rPr>
         <w:drawing>
           <wp:inline distT="0" distB="0" distL="0" distR="0" wp14:anchorId="0EF382E0" wp14:editId="1F0D4103">
             <wp:extent cx="5943600" cy="2085340"/>
@@ -2203,6 +2237,9 @@
     </w:p>
     <w:p>
       <w:r>
+        <w:rPr>
+          <w:noProof/>
+        </w:rPr>
         <w:drawing>
           <wp:inline distT="0" distB="0" distL="0" distR="0" wp14:anchorId="1ACA0745" wp14:editId="58D8B32B">
             <wp:extent cx="5943600" cy="3180715"/>
@@ -2242,6 +2279,9 @@
     </w:p>
     <w:p>
       <w:r>
+        <w:rPr>
+          <w:noProof/>
+        </w:rPr>
         <w:drawing>
           <wp:inline distT="0" distB="0" distL="0" distR="0" wp14:anchorId="301EB36C" wp14:editId="3D1AB0EE">
             <wp:extent cx="5943600" cy="1826260"/>
@@ -2329,10 +2369,10 @@
     <w:p>
       <w:r>
         <w:drawing>
-          <wp:inline distT="0" distB="0" distL="0" distR="0" wp14:anchorId="25240819" wp14:editId="72576A24">
-            <wp:extent cx="3463290" cy="8229600"/>
-            <wp:effectExtent l="0" t="0" r="3810" b="0"/>
-            <wp:docPr id="777573088" name="Picture 1"/>
+          <wp:inline distT="0" distB="0" distL="0" distR="0" wp14:anchorId="193970BA" wp14:editId="4BA65793">
+            <wp:extent cx="4119245" cy="8229600"/>
+            <wp:effectExtent l="0" t="0" r="0" b="0"/>
+            <wp:docPr id="739843569" name="Picture 1"/>
             <wp:cNvGraphicFramePr>
               <a:graphicFrameLocks xmlns:a="http://schemas.openxmlformats.org/drawingml/2006/main" noChangeAspect="1"/>
             </wp:cNvGraphicFramePr>
@@ -2340,7 +2380,7 @@
               <a:graphicData uri="http://schemas.openxmlformats.org/drawingml/2006/picture">
                 <pic:pic xmlns:pic="http://schemas.openxmlformats.org/drawingml/2006/picture">
                   <pic:nvPicPr>
-                    <pic:cNvPr id="777573088" name=""/>
+                    <pic:cNvPr id="739843569" name=""/>
                     <pic:cNvPicPr/>
                   </pic:nvPicPr>
                   <pic:blipFill>
@@ -2352,7 +2392,7 @@
                   <pic:spPr>
                     <a:xfrm>
                       <a:off x="0" y="0"/>
-                      <a:ext cx="3463290" cy="8229600"/>
+                      <a:ext cx="4119245" cy="8229600"/>
                     </a:xfrm>
                     <a:prstGeom prst="rect">
                       <a:avLst/>
@@ -2365,13 +2405,14 @@
         </w:drawing>
       </w:r>
     </w:p>
+    <w:p/>
     <w:p>
       <w:r>
         <w:drawing>
-          <wp:inline distT="0" distB="0" distL="0" distR="0" wp14:anchorId="279CABDB" wp14:editId="4079A7DB">
-            <wp:extent cx="3505689" cy="3534268"/>
-            <wp:effectExtent l="0" t="0" r="0" b="9525"/>
-            <wp:docPr id="1890013474" name="Picture 1"/>
+          <wp:inline distT="0" distB="0" distL="0" distR="0" wp14:anchorId="3D6A49BC" wp14:editId="7DFAF96B">
+            <wp:extent cx="5943600" cy="3196590"/>
+            <wp:effectExtent l="0" t="0" r="0" b="3810"/>
+            <wp:docPr id="850391731" name="Picture 1"/>
             <wp:cNvGraphicFramePr>
               <a:graphicFrameLocks xmlns:a="http://schemas.openxmlformats.org/drawingml/2006/main" noChangeAspect="1"/>
             </wp:cNvGraphicFramePr>
@@ -2379,7 +2420,7 @@
               <a:graphicData uri="http://schemas.openxmlformats.org/drawingml/2006/picture">
                 <pic:pic xmlns:pic="http://schemas.openxmlformats.org/drawingml/2006/picture">
                   <pic:nvPicPr>
-                    <pic:cNvPr id="1890013474" name=""/>
+                    <pic:cNvPr id="850391731" name=""/>
                     <pic:cNvPicPr/>
                   </pic:nvPicPr>
                   <pic:blipFill>
@@ -2391,7 +2432,7 @@
                   <pic:spPr>
                     <a:xfrm>
                       <a:off x="0" y="0"/>
-                      <a:ext cx="3505689" cy="3534268"/>
+                      <a:ext cx="5943600" cy="3196590"/>
                     </a:xfrm>
                     <a:prstGeom prst="rect">
                       <a:avLst/>
@@ -2404,14 +2445,13 @@
         </w:drawing>
       </w:r>
     </w:p>
-    <w:p/>
     <w:p>
       <w:r>
         <w:drawing>
-          <wp:inline distT="0" distB="0" distL="0" distR="0" wp14:anchorId="2602E9E1" wp14:editId="0E1E2D4E">
-            <wp:extent cx="5943600" cy="5436235"/>
-            <wp:effectExtent l="0" t="0" r="0" b="0"/>
-            <wp:docPr id="1367857779" name="Picture 1"/>
+          <wp:inline distT="0" distB="0" distL="0" distR="0" wp14:anchorId="696B0EEB" wp14:editId="24693964">
+            <wp:extent cx="5943600" cy="3043555"/>
+            <wp:effectExtent l="0" t="0" r="0" b="4445"/>
+            <wp:docPr id="480564509" name="Picture 1"/>
             <wp:cNvGraphicFramePr>
               <a:graphicFrameLocks xmlns:a="http://schemas.openxmlformats.org/drawingml/2006/main" noChangeAspect="1"/>
             </wp:cNvGraphicFramePr>
@@ -2419,7 +2459,7 @@
               <a:graphicData uri="http://schemas.openxmlformats.org/drawingml/2006/picture">
                 <pic:pic xmlns:pic="http://schemas.openxmlformats.org/drawingml/2006/picture">
                   <pic:nvPicPr>
-                    <pic:cNvPr id="1367857779" name=""/>
+                    <pic:cNvPr id="480564509" name=""/>
                     <pic:cNvPicPr/>
                   </pic:nvPicPr>
                   <pic:blipFill>
@@ -2431,7 +2471,7 @@
                   <pic:spPr>
                     <a:xfrm>
                       <a:off x="0" y="0"/>
-                      <a:ext cx="5943600" cy="5436235"/>
+                      <a:ext cx="5943600" cy="3043555"/>
                     </a:xfrm>
                     <a:prstGeom prst="rect">
                       <a:avLst/>
@@ -2447,10 +2487,10 @@
     <w:p>
       <w:r>
         <w:drawing>
-          <wp:inline distT="0" distB="0" distL="0" distR="0" wp14:anchorId="40BC6A37" wp14:editId="5CFCDE8B">
-            <wp:extent cx="5943600" cy="4999990"/>
-            <wp:effectExtent l="0" t="0" r="0" b="0"/>
-            <wp:docPr id="83526847" name="Picture 1"/>
+          <wp:inline distT="0" distB="0" distL="0" distR="0" wp14:anchorId="4F16F89F" wp14:editId="3F4CBAE3">
+            <wp:extent cx="5487166" cy="7401958"/>
+            <wp:effectExtent l="0" t="0" r="0" b="8890"/>
+            <wp:docPr id="1232713793" name="Picture 1"/>
             <wp:cNvGraphicFramePr>
               <a:graphicFrameLocks xmlns:a="http://schemas.openxmlformats.org/drawingml/2006/main" noChangeAspect="1"/>
             </wp:cNvGraphicFramePr>
@@ -2458,7 +2498,7 @@
               <a:graphicData uri="http://schemas.openxmlformats.org/drawingml/2006/picture">
                 <pic:pic xmlns:pic="http://schemas.openxmlformats.org/drawingml/2006/picture">
                   <pic:nvPicPr>
-                    <pic:cNvPr id="83526847" name=""/>
+                    <pic:cNvPr id="1232713793" name=""/>
                     <pic:cNvPicPr/>
                   </pic:nvPicPr>
                   <pic:blipFill>
@@ -2470,7 +2510,7 @@
                   <pic:spPr>
                     <a:xfrm>
                       <a:off x="0" y="0"/>
-                      <a:ext cx="5943600" cy="4999990"/>
+                      <a:ext cx="5487166" cy="7401958"/>
                     </a:xfrm>
                     <a:prstGeom prst="rect">
                       <a:avLst/>
@@ -2486,10 +2526,10 @@
     <w:p>
       <w:r>
         <w:drawing>
-          <wp:inline distT="0" distB="0" distL="0" distR="0" wp14:anchorId="2265D0AB" wp14:editId="3702EED6">
-            <wp:extent cx="4191585" cy="5515745"/>
-            <wp:effectExtent l="0" t="0" r="0" b="8890"/>
-            <wp:docPr id="942374664" name="Picture 1"/>
+          <wp:inline distT="0" distB="0" distL="0" distR="0" wp14:anchorId="18BAD967" wp14:editId="5332FE56">
+            <wp:extent cx="4286848" cy="3524742"/>
+            <wp:effectExtent l="0" t="0" r="0" b="0"/>
+            <wp:docPr id="1852639026" name="Picture 1"/>
             <wp:cNvGraphicFramePr>
               <a:graphicFrameLocks xmlns:a="http://schemas.openxmlformats.org/drawingml/2006/main" noChangeAspect="1"/>
             </wp:cNvGraphicFramePr>
@@ -2497,7 +2537,7 @@
               <a:graphicData uri="http://schemas.openxmlformats.org/drawingml/2006/picture">
                 <pic:pic xmlns:pic="http://schemas.openxmlformats.org/drawingml/2006/picture">
                   <pic:nvPicPr>
-                    <pic:cNvPr id="942374664" name=""/>
+                    <pic:cNvPr id="1852639026" name=""/>
                     <pic:cNvPicPr/>
                   </pic:nvPicPr>
                   <pic:blipFill>
@@ -2509,7 +2549,7 @@
                   <pic:spPr>
                     <a:xfrm>
                       <a:off x="0" y="0"/>
-                      <a:ext cx="4191585" cy="5515745"/>
+                      <a:ext cx="4286848" cy="3524742"/>
                     </a:xfrm>
                     <a:prstGeom prst="rect">
                       <a:avLst/>
@@ -2525,10 +2565,10 @@
     <w:p>
       <w:r>
         <w:drawing>
-          <wp:inline distT="0" distB="0" distL="0" distR="0" wp14:anchorId="1BC5A90F" wp14:editId="08F35348">
-            <wp:extent cx="4124901" cy="1419423"/>
+          <wp:inline distT="0" distB="0" distL="0" distR="0" wp14:anchorId="34778033" wp14:editId="677DE7E3">
+            <wp:extent cx="4105848" cy="1400370"/>
             <wp:effectExtent l="0" t="0" r="9525" b="9525"/>
-            <wp:docPr id="255781183" name="Picture 1"/>
+            <wp:docPr id="1872324878" name="Picture 1"/>
             <wp:cNvGraphicFramePr>
               <a:graphicFrameLocks xmlns:a="http://schemas.openxmlformats.org/drawingml/2006/main" noChangeAspect="1"/>
             </wp:cNvGraphicFramePr>
@@ -2536,7 +2576,7 @@
               <a:graphicData uri="http://schemas.openxmlformats.org/drawingml/2006/picture">
                 <pic:pic xmlns:pic="http://schemas.openxmlformats.org/drawingml/2006/picture">
                   <pic:nvPicPr>
-                    <pic:cNvPr id="255781183" name=""/>
+                    <pic:cNvPr id="1872324878" name=""/>
                     <pic:cNvPicPr/>
                   </pic:nvPicPr>
                   <pic:blipFill>
@@ -2548,7 +2588,7 @@
                   <pic:spPr>
                     <a:xfrm>
                       <a:off x="0" y="0"/>
-                      <a:ext cx="4124901" cy="1419423"/>
+                      <a:ext cx="4105848" cy="1400370"/>
                     </a:xfrm>
                     <a:prstGeom prst="rect">
                       <a:avLst/>
@@ -2570,10 +2610,10 @@
     <w:p>
       <w:r>
         <w:drawing>
-          <wp:inline distT="0" distB="0" distL="0" distR="0" wp14:anchorId="48FB389C" wp14:editId="68B7A2C5">
-            <wp:extent cx="3778250" cy="8229600"/>
+          <wp:inline distT="0" distB="0" distL="0" distR="0" wp14:anchorId="34C66662" wp14:editId="3A5293C5">
+            <wp:extent cx="3567430" cy="8229600"/>
             <wp:effectExtent l="0" t="0" r="0" b="0"/>
-            <wp:docPr id="1770779617" name="Picture 1"/>
+            <wp:docPr id="1382205948" name="Picture 1"/>
             <wp:cNvGraphicFramePr>
               <a:graphicFrameLocks xmlns:a="http://schemas.openxmlformats.org/drawingml/2006/main" noChangeAspect="1"/>
             </wp:cNvGraphicFramePr>
@@ -2581,7 +2621,7 @@
               <a:graphicData uri="http://schemas.openxmlformats.org/drawingml/2006/picture">
                 <pic:pic xmlns:pic="http://schemas.openxmlformats.org/drawingml/2006/picture">
                   <pic:nvPicPr>
-                    <pic:cNvPr id="1770779617" name=""/>
+                    <pic:cNvPr id="1382205948" name=""/>
                     <pic:cNvPicPr/>
                   </pic:nvPicPr>
                   <pic:blipFill>
@@ -2593,7 +2633,7 @@
                   <pic:spPr>
                     <a:xfrm>
                       <a:off x="0" y="0"/>
-                      <a:ext cx="3778250" cy="8229600"/>
+                      <a:ext cx="3567430" cy="8229600"/>
                     </a:xfrm>
                     <a:prstGeom prst="rect">
                       <a:avLst/>
@@ -2606,13 +2646,14 @@
         </w:drawing>
       </w:r>
     </w:p>
+    <w:p/>
     <w:p>
       <w:r>
         <w:drawing>
-          <wp:inline distT="0" distB="0" distL="0" distR="0" wp14:anchorId="202B671E" wp14:editId="3C1FB341">
-            <wp:extent cx="2572109" cy="2200582"/>
-            <wp:effectExtent l="0" t="0" r="0" b="9525"/>
-            <wp:docPr id="1000489609" name="Picture 1"/>
+          <wp:inline distT="0" distB="0" distL="0" distR="0" wp14:anchorId="1E33461E" wp14:editId="4DD31CAA">
+            <wp:extent cx="5943600" cy="3301365"/>
+            <wp:effectExtent l="0" t="0" r="0" b="0"/>
+            <wp:docPr id="1696409373" name="Picture 1"/>
             <wp:cNvGraphicFramePr>
               <a:graphicFrameLocks xmlns:a="http://schemas.openxmlformats.org/drawingml/2006/main" noChangeAspect="1"/>
             </wp:cNvGraphicFramePr>
@@ -2620,7 +2661,7 @@
               <a:graphicData uri="http://schemas.openxmlformats.org/drawingml/2006/picture">
                 <pic:pic xmlns:pic="http://schemas.openxmlformats.org/drawingml/2006/picture">
                   <pic:nvPicPr>
-                    <pic:cNvPr id="1000489609" name=""/>
+                    <pic:cNvPr id="1696409373" name=""/>
                     <pic:cNvPicPr/>
                   </pic:nvPicPr>
                   <pic:blipFill>
@@ -2632,7 +2673,7 @@
                   <pic:spPr>
                     <a:xfrm>
                       <a:off x="0" y="0"/>
-                      <a:ext cx="2572109" cy="2200582"/>
+                      <a:ext cx="5943600" cy="3301365"/>
                     </a:xfrm>
                     <a:prstGeom prst="rect">
                       <a:avLst/>
@@ -2648,10 +2689,10 @@
     <w:p>
       <w:r>
         <w:drawing>
-          <wp:inline distT="0" distB="0" distL="0" distR="0" wp14:anchorId="4A6990E1" wp14:editId="42E54114">
-            <wp:extent cx="5943600" cy="5311140"/>
-            <wp:effectExtent l="0" t="0" r="0" b="3810"/>
-            <wp:docPr id="1540303037" name="Picture 1"/>
+          <wp:inline distT="0" distB="0" distL="0" distR="0" wp14:anchorId="53EFE76C" wp14:editId="155DEAAF">
+            <wp:extent cx="5943600" cy="3028950"/>
+            <wp:effectExtent l="0" t="0" r="0" b="0"/>
+            <wp:docPr id="1161347976" name="Picture 1"/>
             <wp:cNvGraphicFramePr>
               <a:graphicFrameLocks xmlns:a="http://schemas.openxmlformats.org/drawingml/2006/main" noChangeAspect="1"/>
             </wp:cNvGraphicFramePr>
@@ -2659,7 +2700,7 @@
               <a:graphicData uri="http://schemas.openxmlformats.org/drawingml/2006/picture">
                 <pic:pic xmlns:pic="http://schemas.openxmlformats.org/drawingml/2006/picture">
                   <pic:nvPicPr>
-                    <pic:cNvPr id="1540303037" name=""/>
+                    <pic:cNvPr id="1161347976" name=""/>
                     <pic:cNvPicPr/>
                   </pic:nvPicPr>
                   <pic:blipFill>
@@ -2671,7 +2712,7 @@
                   <pic:spPr>
                     <a:xfrm>
                       <a:off x="0" y="0"/>
-                      <a:ext cx="5943600" cy="5311140"/>
+                      <a:ext cx="5943600" cy="3028950"/>
                     </a:xfrm>
                     <a:prstGeom prst="rect">
                       <a:avLst/>
@@ -2687,10 +2728,10 @@
     <w:p>
       <w:r>
         <w:drawing>
-          <wp:inline distT="0" distB="0" distL="0" distR="0" wp14:anchorId="6CE8D15F" wp14:editId="1F21E346">
-            <wp:extent cx="5943600" cy="5598795"/>
-            <wp:effectExtent l="0" t="0" r="0" b="1905"/>
-            <wp:docPr id="1159182626" name="Picture 1"/>
+          <wp:inline distT="0" distB="0" distL="0" distR="0" wp14:anchorId="446AC626" wp14:editId="4F406D48">
+            <wp:extent cx="5353797" cy="7497221"/>
+            <wp:effectExtent l="0" t="0" r="0" b="8890"/>
+            <wp:docPr id="241799577" name="Picture 1"/>
             <wp:cNvGraphicFramePr>
               <a:graphicFrameLocks xmlns:a="http://schemas.openxmlformats.org/drawingml/2006/main" noChangeAspect="1"/>
             </wp:cNvGraphicFramePr>
@@ -2698,7 +2739,7 @@
               <a:graphicData uri="http://schemas.openxmlformats.org/drawingml/2006/picture">
                 <pic:pic xmlns:pic="http://schemas.openxmlformats.org/drawingml/2006/picture">
                   <pic:nvPicPr>
-                    <pic:cNvPr id="1159182626" name=""/>
+                    <pic:cNvPr id="241799577" name=""/>
                     <pic:cNvPicPr/>
                   </pic:nvPicPr>
                   <pic:blipFill>
@@ -2710,7 +2751,7 @@
                   <pic:spPr>
                     <a:xfrm>
                       <a:off x="0" y="0"/>
-                      <a:ext cx="5943600" cy="5598795"/>
+                      <a:ext cx="5353797" cy="7497221"/>
                     </a:xfrm>
                     <a:prstGeom prst="rect">
                       <a:avLst/>
@@ -2726,10 +2767,10 @@
     <w:p>
       <w:r>
         <w:drawing>
-          <wp:inline distT="0" distB="0" distL="0" distR="0" wp14:anchorId="475B2015" wp14:editId="0DEA95A8">
-            <wp:extent cx="3762900" cy="5401429"/>
-            <wp:effectExtent l="0" t="0" r="9525" b="8890"/>
-            <wp:docPr id="1403123016" name="Picture 1"/>
+          <wp:inline distT="0" distB="0" distL="0" distR="0" wp14:anchorId="5E7D08BC" wp14:editId="7DC4F5A0">
+            <wp:extent cx="4229690" cy="3572374"/>
+            <wp:effectExtent l="0" t="0" r="0" b="9525"/>
+            <wp:docPr id="1361882470" name="Picture 1"/>
             <wp:cNvGraphicFramePr>
               <a:graphicFrameLocks xmlns:a="http://schemas.openxmlformats.org/drawingml/2006/main" noChangeAspect="1"/>
             </wp:cNvGraphicFramePr>
@@ -2737,7 +2778,7 @@
               <a:graphicData uri="http://schemas.openxmlformats.org/drawingml/2006/picture">
                 <pic:pic xmlns:pic="http://schemas.openxmlformats.org/drawingml/2006/picture">
                   <pic:nvPicPr>
-                    <pic:cNvPr id="1403123016" name=""/>
+                    <pic:cNvPr id="1361882470" name=""/>
                     <pic:cNvPicPr/>
                   </pic:nvPicPr>
                   <pic:blipFill>
@@ -2749,7 +2790,7 @@
                   <pic:spPr>
                     <a:xfrm>
                       <a:off x="0" y="0"/>
-                      <a:ext cx="3762900" cy="5401429"/>
+                      <a:ext cx="4229690" cy="3572374"/>
                     </a:xfrm>
                     <a:prstGeom prst="rect">
                       <a:avLst/>
@@ -2762,13 +2803,19 @@
         </w:drawing>
       </w:r>
     </w:p>
+    <w:p/>
+    <w:p>
+      <w:r>
+        <w:t>Second Floor Switch Config</w:t>
+      </w:r>
+    </w:p>
     <w:p>
       <w:r>
         <w:drawing>
-          <wp:inline distT="0" distB="0" distL="0" distR="0" wp14:anchorId="03FA6EBF" wp14:editId="39774E8F">
-            <wp:extent cx="4039164" cy="1952898"/>
-            <wp:effectExtent l="0" t="0" r="0" b="9525"/>
-            <wp:docPr id="803603901" name="Picture 1"/>
+          <wp:inline distT="0" distB="0" distL="0" distR="0" wp14:anchorId="1907C3AA" wp14:editId="59EA025C">
+            <wp:extent cx="4023995" cy="8229600"/>
+            <wp:effectExtent l="0" t="0" r="0" b="0"/>
+            <wp:docPr id="1484125637" name="Picture 1"/>
             <wp:cNvGraphicFramePr>
               <a:graphicFrameLocks xmlns:a="http://schemas.openxmlformats.org/drawingml/2006/main" noChangeAspect="1"/>
             </wp:cNvGraphicFramePr>
@@ -2776,7 +2823,7 @@
               <a:graphicData uri="http://schemas.openxmlformats.org/drawingml/2006/picture">
                 <pic:pic xmlns:pic="http://schemas.openxmlformats.org/drawingml/2006/picture">
                   <pic:nvPicPr>
-                    <pic:cNvPr id="803603901" name=""/>
+                    <pic:cNvPr id="1484125637" name=""/>
                     <pic:cNvPicPr/>
                   </pic:nvPicPr>
                   <pic:blipFill>
@@ -2788,7 +2835,7 @@
                   <pic:spPr>
                     <a:xfrm>
                       <a:off x="0" y="0"/>
-                      <a:ext cx="4039164" cy="1952898"/>
+                      <a:ext cx="4023995" cy="8229600"/>
                     </a:xfrm>
                     <a:prstGeom prst="rect">
                       <a:avLst/>
@@ -2804,16 +2851,11 @@
     <w:p/>
     <w:p>
       <w:r>
-        <w:t>Second Floor Switch Config</w:t>
-      </w:r>
-    </w:p>
-    <w:p>
-      <w:r>
         <w:drawing>
-          <wp:inline distT="0" distB="0" distL="0" distR="0" wp14:anchorId="29605A3A" wp14:editId="707230D8">
-            <wp:extent cx="2811780" cy="8229600"/>
-            <wp:effectExtent l="0" t="0" r="7620" b="0"/>
-            <wp:docPr id="1302235879" name="Picture 1"/>
+          <wp:inline distT="0" distB="0" distL="0" distR="0" wp14:anchorId="589DCAC7" wp14:editId="5FEA1BFF">
+            <wp:extent cx="5943600" cy="3226435"/>
+            <wp:effectExtent l="0" t="0" r="0" b="0"/>
+            <wp:docPr id="535758596" name="Picture 1"/>
             <wp:cNvGraphicFramePr>
               <a:graphicFrameLocks xmlns:a="http://schemas.openxmlformats.org/drawingml/2006/main" noChangeAspect="1"/>
             </wp:cNvGraphicFramePr>
@@ -2821,7 +2863,7 @@
               <a:graphicData uri="http://schemas.openxmlformats.org/drawingml/2006/picture">
                 <pic:pic xmlns:pic="http://schemas.openxmlformats.org/drawingml/2006/picture">
                   <pic:nvPicPr>
-                    <pic:cNvPr id="1302235879" name=""/>
+                    <pic:cNvPr id="535758596" name=""/>
                     <pic:cNvPicPr/>
                   </pic:nvPicPr>
                   <pic:blipFill>
@@ -2833,7 +2875,7 @@
                   <pic:spPr>
                     <a:xfrm>
                       <a:off x="0" y="0"/>
-                      <a:ext cx="2811780" cy="8229600"/>
+                      <a:ext cx="5943600" cy="3226435"/>
                     </a:xfrm>
                     <a:prstGeom prst="rect">
                       <a:avLst/>
@@ -2846,13 +2888,14 @@
         </w:drawing>
       </w:r>
     </w:p>
+    <w:p/>
     <w:p>
       <w:r>
         <w:drawing>
-          <wp:inline distT="0" distB="0" distL="0" distR="0" wp14:anchorId="15B95D37" wp14:editId="0339C46D">
-            <wp:extent cx="2514951" cy="2152950"/>
-            <wp:effectExtent l="0" t="0" r="0" b="0"/>
-            <wp:docPr id="633933515" name="Picture 1"/>
+          <wp:inline distT="0" distB="0" distL="0" distR="0" wp14:anchorId="56C0C362" wp14:editId="1E61533F">
+            <wp:extent cx="5943600" cy="3312795"/>
+            <wp:effectExtent l="0" t="0" r="0" b="1905"/>
+            <wp:docPr id="2020582973" name="Picture 1"/>
             <wp:cNvGraphicFramePr>
               <a:graphicFrameLocks xmlns:a="http://schemas.openxmlformats.org/drawingml/2006/main" noChangeAspect="1"/>
             </wp:cNvGraphicFramePr>
@@ -2860,7 +2903,7 @@
               <a:graphicData uri="http://schemas.openxmlformats.org/drawingml/2006/picture">
                 <pic:pic xmlns:pic="http://schemas.openxmlformats.org/drawingml/2006/picture">
                   <pic:nvPicPr>
-                    <pic:cNvPr id="633933515" name=""/>
+                    <pic:cNvPr id="2020582973" name=""/>
                     <pic:cNvPicPr/>
                   </pic:nvPicPr>
                   <pic:blipFill>
@@ -2872,7 +2915,7 @@
                   <pic:spPr>
                     <a:xfrm>
                       <a:off x="0" y="0"/>
-                      <a:ext cx="2514951" cy="2152950"/>
+                      <a:ext cx="5943600" cy="3312795"/>
                     </a:xfrm>
                     <a:prstGeom prst="rect">
                       <a:avLst/>
@@ -2888,10 +2931,10 @@
     <w:p>
       <w:r>
         <w:drawing>
-          <wp:inline distT="0" distB="0" distL="0" distR="0" wp14:anchorId="6EACBE34" wp14:editId="3AFE2543">
-            <wp:extent cx="5943600" cy="5758815"/>
-            <wp:effectExtent l="0" t="0" r="0" b="0"/>
-            <wp:docPr id="605694231" name="Picture 1"/>
+          <wp:inline distT="0" distB="0" distL="0" distR="0" wp14:anchorId="4F41817B" wp14:editId="1F1120BB">
+            <wp:extent cx="5172797" cy="7430537"/>
+            <wp:effectExtent l="0" t="0" r="8890" b="0"/>
+            <wp:docPr id="730479517" name="Picture 1"/>
             <wp:cNvGraphicFramePr>
               <a:graphicFrameLocks xmlns:a="http://schemas.openxmlformats.org/drawingml/2006/main" noChangeAspect="1"/>
             </wp:cNvGraphicFramePr>
@@ -2899,7 +2942,7 @@
               <a:graphicData uri="http://schemas.openxmlformats.org/drawingml/2006/picture">
                 <pic:pic xmlns:pic="http://schemas.openxmlformats.org/drawingml/2006/picture">
                   <pic:nvPicPr>
-                    <pic:cNvPr id="605694231" name=""/>
+                    <pic:cNvPr id="730479517" name=""/>
                     <pic:cNvPicPr/>
                   </pic:nvPicPr>
                   <pic:blipFill>
@@ -2911,7 +2954,7 @@
                   <pic:spPr>
                     <a:xfrm>
                       <a:off x="0" y="0"/>
-                      <a:ext cx="5943600" cy="5758815"/>
+                      <a:ext cx="5172797" cy="7430537"/>
                     </a:xfrm>
                     <a:prstGeom prst="rect">
                       <a:avLst/>
@@ -2924,14 +2967,13 @@
         </w:drawing>
       </w:r>
     </w:p>
-    <w:p/>
     <w:p>
       <w:r>
         <w:drawing>
-          <wp:inline distT="0" distB="0" distL="0" distR="0" wp14:anchorId="3C2D9190" wp14:editId="3C6E2724">
-            <wp:extent cx="5943600" cy="5448300"/>
+          <wp:inline distT="0" distB="0" distL="0" distR="0" wp14:anchorId="6B8F1BBD" wp14:editId="6C280D7B">
+            <wp:extent cx="4267796" cy="3505689"/>
             <wp:effectExtent l="0" t="0" r="0" b="0"/>
-            <wp:docPr id="1101381576" name="Picture 1"/>
+            <wp:docPr id="1842285774" name="Picture 1"/>
             <wp:cNvGraphicFramePr>
               <a:graphicFrameLocks xmlns:a="http://schemas.openxmlformats.org/drawingml/2006/main" noChangeAspect="1"/>
             </wp:cNvGraphicFramePr>
@@ -2939,7 +2981,7 @@
               <a:graphicData uri="http://schemas.openxmlformats.org/drawingml/2006/picture">
                 <pic:pic xmlns:pic="http://schemas.openxmlformats.org/drawingml/2006/picture">
                   <pic:nvPicPr>
-                    <pic:cNvPr id="1101381576" name=""/>
+                    <pic:cNvPr id="1842285774" name=""/>
                     <pic:cNvPicPr/>
                   </pic:nvPicPr>
                   <pic:blipFill>
@@ -2951,7 +2993,7 @@
                   <pic:spPr>
                     <a:xfrm>
                       <a:off x="0" y="0"/>
-                      <a:ext cx="5943600" cy="5448300"/>
+                      <a:ext cx="4267796" cy="3505689"/>
                     </a:xfrm>
                     <a:prstGeom prst="rect">
                       <a:avLst/>
@@ -2964,84 +3006,6 @@
         </w:drawing>
       </w:r>
     </w:p>
-    <w:p>
-      <w:r>
-        <w:drawing>
-          <wp:inline distT="0" distB="0" distL="0" distR="0" wp14:anchorId="4B3B011D" wp14:editId="31A6A28F">
-            <wp:extent cx="3829584" cy="4953691"/>
-            <wp:effectExtent l="0" t="0" r="0" b="0"/>
-            <wp:docPr id="892248390" name="Picture 1"/>
-            <wp:cNvGraphicFramePr>
-              <a:graphicFrameLocks xmlns:a="http://schemas.openxmlformats.org/drawingml/2006/main" noChangeAspect="1"/>
-            </wp:cNvGraphicFramePr>
-            <a:graphic xmlns:a="http://schemas.openxmlformats.org/drawingml/2006/main">
-              <a:graphicData uri="http://schemas.openxmlformats.org/drawingml/2006/picture">
-                <pic:pic xmlns:pic="http://schemas.openxmlformats.org/drawingml/2006/picture">
-                  <pic:nvPicPr>
-                    <pic:cNvPr id="892248390" name=""/>
-                    <pic:cNvPicPr/>
-                  </pic:nvPicPr>
-                  <pic:blipFill>
-                    <a:blip r:embed="rId39"/>
-                    <a:stretch>
-                      <a:fillRect/>
-                    </a:stretch>
-                  </pic:blipFill>
-                  <pic:spPr>
-                    <a:xfrm>
-                      <a:off x="0" y="0"/>
-                      <a:ext cx="3829584" cy="4953691"/>
-                    </a:xfrm>
-                    <a:prstGeom prst="rect">
-                      <a:avLst/>
-                    </a:prstGeom>
-                  </pic:spPr>
-                </pic:pic>
-              </a:graphicData>
-            </a:graphic>
-          </wp:inline>
-        </w:drawing>
-      </w:r>
-    </w:p>
-    <w:p>
-      <w:r>
-        <w:drawing>
-          <wp:inline distT="0" distB="0" distL="0" distR="0" wp14:anchorId="5CD36756" wp14:editId="353032F2">
-            <wp:extent cx="4344006" cy="2333951"/>
-            <wp:effectExtent l="0" t="0" r="0" b="9525"/>
-            <wp:docPr id="1152821838" name="Picture 1"/>
-            <wp:cNvGraphicFramePr>
-              <a:graphicFrameLocks xmlns:a="http://schemas.openxmlformats.org/drawingml/2006/main" noChangeAspect="1"/>
-            </wp:cNvGraphicFramePr>
-            <a:graphic xmlns:a="http://schemas.openxmlformats.org/drawingml/2006/main">
-              <a:graphicData uri="http://schemas.openxmlformats.org/drawingml/2006/picture">
-                <pic:pic xmlns:pic="http://schemas.openxmlformats.org/drawingml/2006/picture">
-                  <pic:nvPicPr>
-                    <pic:cNvPr id="1152821838" name=""/>
-                    <pic:cNvPicPr/>
-                  </pic:nvPicPr>
-                  <pic:blipFill>
-                    <a:blip r:embed="rId40"/>
-                    <a:stretch>
-                      <a:fillRect/>
-                    </a:stretch>
-                  </pic:blipFill>
-                  <pic:spPr>
-                    <a:xfrm>
-                      <a:off x="0" y="0"/>
-                      <a:ext cx="4344006" cy="2333951"/>
-                    </a:xfrm>
-                    <a:prstGeom prst="rect">
-                      <a:avLst/>
-                    </a:prstGeom>
-                  </pic:spPr>
-                </pic:pic>
-              </a:graphicData>
-            </a:graphic>
-          </wp:inline>
-        </w:drawing>
-      </w:r>
-    </w:p>
     <w:p/>
     <w:p>
       <w:pPr>
@@ -7946,10 +7910,10 @@
       </w:pPr>
     </w:p>
     <w:sectPr>
-      <w:headerReference w:type="default" r:id="rId41"/>
-      <w:footerReference w:type="default" r:id="rId42"/>
-      <w:headerReference w:type="first" r:id="rId43"/>
-      <w:footerReference w:type="first" r:id="rId44"/>
+      <w:headerReference w:type="default" r:id="rId39"/>
+      <w:footerReference w:type="default" r:id="rId40"/>
+      <w:headerReference w:type="first" r:id="rId41"/>
+      <w:footerReference w:type="first" r:id="rId42"/>
       <w:type w:val="continuous"/>
       <w:pgSz w:w="12240" w:h="15840"/>
       <w:pgMar w:top="1440" w:right="1440" w:bottom="1440" w:left="1440" w:header="720" w:footer="432" w:gutter="0"/>
@@ -10645,6 +10609,21 @@
 </file>
 
 <file path=customXml/item3.xml><?xml version="1.0" encoding="utf-8"?>
+<b:Sources xmlns:b="http://schemas.openxmlformats.org/officeDocument/2006/bibliography" xmlns="http://schemas.openxmlformats.org/officeDocument/2006/bibliography" SelectedStyle="\APASixthEditionOfficeOnline.xsl" StyleName="APA" Version="6"/>
+</file>
+
+<file path=customXml/item4.xml><?xml version="1.0" encoding="utf-8"?>
+<p:properties xmlns:p="http://schemas.microsoft.com/office/2006/metadata/properties" xmlns:xsi="http://www.w3.org/2001/XMLSchema-instance" xmlns:pc="http://schemas.microsoft.com/office/infopath/2007/PartnerControls">
+  <documentManagement>
+    <lcf76f155ced4ddcb4097134ff3c332f xmlns="8cb223eb-8fc9-43bb-896c-9785dfdd840e">
+      <Terms xmlns="http://schemas.microsoft.com/office/infopath/2007/PartnerControls"/>
+    </lcf76f155ced4ddcb4097134ff3c332f>
+    <TaxCatchAll xmlns="530517bb-b50c-4599-82d9-b1a16adffa97" xsi:nil="true"/>
+  </documentManagement>
+</p:properties>
+</file>
+
+<file path=customXml/item5.xml><?xml version="1.0" encoding="utf-8"?>
 <ct:contentTypeSchema xmlns:ct="http://schemas.microsoft.com/office/2006/metadata/contentType" xmlns:ma="http://schemas.microsoft.com/office/2006/metadata/properties/metaAttributes" ct:_="" ma:_="" ma:contentTypeName="Document" ma:contentTypeID="0x0101006E2604F785F3404D9994F55486916505" ma:contentTypeVersion="9" ma:contentTypeDescription="Create a new document." ma:contentTypeScope="" ma:versionID="f8332895e037df1aba1087d622acc727">
   <xsd:schema xmlns:xsd="http://www.w3.org/2001/XMLSchema" xmlns:xs="http://www.w3.org/2001/XMLSchema" xmlns:p="http://schemas.microsoft.com/office/2006/metadata/properties" xmlns:ns2="8cb223eb-8fc9-43bb-896c-9785dfdd840e" xmlns:ns3="530517bb-b50c-4599-82d9-b1a16adffa97" targetNamespace="http://schemas.microsoft.com/office/2006/metadata/properties" ma:root="true" ma:fieldsID="c99d5cfa90593929f019df6418f1ae2f" ns2:_="" ns3:_="">
     <xsd:import namespace="8cb223eb-8fc9-43bb-896c-9785dfdd840e"/>
@@ -10839,21 +10818,6 @@
 </ct:contentTypeSchema>
 </file>
 
-<file path=customXml/item4.xml><?xml version="1.0" encoding="utf-8"?>
-<p:properties xmlns:p="http://schemas.microsoft.com/office/2006/metadata/properties" xmlns:xsi="http://www.w3.org/2001/XMLSchema-instance" xmlns:pc="http://schemas.microsoft.com/office/infopath/2007/PartnerControls">
-  <documentManagement>
-    <lcf76f155ced4ddcb4097134ff3c332f xmlns="8cb223eb-8fc9-43bb-896c-9785dfdd840e">
-      <Terms xmlns="http://schemas.microsoft.com/office/infopath/2007/PartnerControls"/>
-    </lcf76f155ced4ddcb4097134ff3c332f>
-    <TaxCatchAll xmlns="530517bb-b50c-4599-82d9-b1a16adffa97" xsi:nil="true"/>
-  </documentManagement>
-</p:properties>
-</file>
-
-<file path=customXml/item5.xml><?xml version="1.0" encoding="utf-8"?>
-<b:Sources xmlns:b="http://schemas.openxmlformats.org/officeDocument/2006/bibliography" xmlns="http://schemas.openxmlformats.org/officeDocument/2006/bibliography" SelectedStyle="\APASixthEditionOfficeOnline.xsl" StyleName="APA" Version="6"/>
-</file>
-
 <file path=customXml/itemProps1.xml><?xml version="1.0" encoding="utf-8"?>
 <ds:datastoreItem xmlns:ds="http://schemas.openxmlformats.org/officeDocument/2006/customXml" ds:itemID="{55AF091B-3C7A-41E3-B477-F2FDAA23CFDA}">
   <ds:schemaRefs>
@@ -10871,6 +10835,25 @@
 </file>
 
 <file path=customXml/itemProps3.xml><?xml version="1.0" encoding="utf-8"?>
+<ds:datastoreItem xmlns:ds="http://schemas.openxmlformats.org/officeDocument/2006/customXml" ds:itemID="{1B6B35DE-0877-4E66-80B1-D9587151751D}">
+  <ds:schemaRefs>
+    <ds:schemaRef ds:uri="http://schemas.openxmlformats.org/officeDocument/2006/bibliography"/>
+  </ds:schemaRefs>
+</ds:datastoreItem>
+</file>
+
+<file path=customXml/itemProps4.xml><?xml version="1.0" encoding="utf-8"?>
+<ds:datastoreItem xmlns:ds="http://schemas.openxmlformats.org/officeDocument/2006/customXml" ds:itemID="{E23E4120-D6A2-4237-8072-707FB1C50E55}">
+  <ds:schemaRefs>
+    <ds:schemaRef ds:uri="http://schemas.microsoft.com/office/2006/metadata/properties"/>
+    <ds:schemaRef ds:uri="http://schemas.microsoft.com/office/infopath/2007/PartnerControls"/>
+    <ds:schemaRef ds:uri="8cb223eb-8fc9-43bb-896c-9785dfdd840e"/>
+    <ds:schemaRef ds:uri="530517bb-b50c-4599-82d9-b1a16adffa97"/>
+  </ds:schemaRefs>
+</ds:datastoreItem>
+</file>
+
+<file path=customXml/itemProps5.xml><?xml version="1.0" encoding="utf-8"?>
 <ds:datastoreItem xmlns:ds="http://schemas.openxmlformats.org/officeDocument/2006/customXml" ds:itemID="{CCCC9AE2-3E56-4C20-AC29-05191EC5D07B}">
   <ds:schemaRefs>
     <ds:schemaRef ds:uri="http://schemas.microsoft.com/office/2006/metadata/contentType"/>
@@ -10887,23 +10870,4 @@
     <ds:schemaRef ds:uri="http://schemas.microsoft.com/internal/obd"/>
   </ds:schemaRefs>
 </ds:datastoreItem>
-</file>
-
-<file path=customXml/itemProps4.xml><?xml version="1.0" encoding="utf-8"?>
-<ds:datastoreItem xmlns:ds="http://schemas.openxmlformats.org/officeDocument/2006/customXml" ds:itemID="{E23E4120-D6A2-4237-8072-707FB1C50E55}">
-  <ds:schemaRefs>
-    <ds:schemaRef ds:uri="http://schemas.microsoft.com/office/2006/metadata/properties"/>
-    <ds:schemaRef ds:uri="http://schemas.microsoft.com/office/infopath/2007/PartnerControls"/>
-    <ds:schemaRef ds:uri="8cb223eb-8fc9-43bb-896c-9785dfdd840e"/>
-    <ds:schemaRef ds:uri="530517bb-b50c-4599-82d9-b1a16adffa97"/>
-  </ds:schemaRefs>
-</ds:datastoreItem>
-</file>
-
-<file path=customXml/itemProps5.xml><?xml version="1.0" encoding="utf-8"?>
-<ds:datastoreItem xmlns:ds="http://schemas.openxmlformats.org/officeDocument/2006/customXml" ds:itemID="{1B6B35DE-0877-4E66-80B1-D9587151751D}">
-  <ds:schemaRefs>
-    <ds:schemaRef ds:uri="http://schemas.openxmlformats.org/officeDocument/2006/bibliography"/>
-  </ds:schemaRefs>
-</ds:datastoreItem>
 </file>
</xml_diff>

<commit_message>
Added GNS3 diagram. Started adding screenshots to Functionality report
</commit_message>
<xml_diff>
--- a/Course Docs/BSCNE Capstone Functionality Report.docx
+++ b/Course Docs/BSCNE Capstone Functionality Report.docx
@@ -653,7 +653,6 @@
           <w:szCs w:val="18"/>
         </w:rPr>
       </w:pPr>
-      <w:commentRangeStart w:id="0"/>
       <w:r>
         <w:rPr>
           <w:rFonts w:ascii="Verdana" w:eastAsia="Times New Roman" w:hAnsi="Verdana" w:cs="Segoe UI"/>
@@ -673,13 +672,6 @@
           <w:szCs w:val="20"/>
         </w:rPr>
         <w:t> </w:t>
-      </w:r>
-      <w:commentRangeEnd w:id="0"/>
-      <w:r>
-        <w:rPr>
-          <w:rStyle w:val="CommentReference"/>
-        </w:rPr>
-        <w:commentReference w:id="0"/>
       </w:r>
       <w:r>
         <w:rPr>
@@ -1027,95 +1019,79 @@
         <w:spacing w:after="0" w:line="240" w:lineRule="auto"/>
         <w:textAlignment w:val="baseline"/>
         <w:rPr>
-          <w:rFonts w:ascii="Verdana" w:eastAsia="Times New Roman" w:hAnsi="Verdana" w:cs="Segoe UI"/>
-          <w:sz w:val="20"/>
-          <w:szCs w:val="20"/>
-        </w:rPr>
-      </w:pPr>
-      <w:r>
-        <w:rPr>
-          <w:rFonts w:ascii="Verdana" w:eastAsia="Times New Roman" w:hAnsi="Verdana" w:cs="Segoe UI"/>
-          <w:sz w:val="20"/>
-          <w:szCs w:val="20"/>
-        </w:rPr>
-        <w:t xml:space="preserve">The topology utilizes </w:t>
-      </w:r>
-      <w:r>
-        <w:rPr>
-          <w:rFonts w:ascii="Verdana" w:eastAsia="Times New Roman" w:hAnsi="Verdana" w:cs="Segoe UI"/>
-          <w:b/>
-          <w:bCs/>
-          <w:sz w:val="20"/>
-          <w:szCs w:val="20"/>
-        </w:rPr>
-        <w:t>Open vSwitch</w:t>
-      </w:r>
-      <w:r>
-        <w:rPr>
-          <w:rFonts w:ascii="Verdana" w:eastAsia="Times New Roman" w:hAnsi="Verdana" w:cs="Segoe UI"/>
-          <w:sz w:val="20"/>
-          <w:szCs w:val="20"/>
-        </w:rPr>
-        <w:t xml:space="preserve"> instances (MainSwitch, </w:t>
-      </w:r>
-      <w:proofErr w:type="spellStart"/>
-      <w:r>
-        <w:rPr>
-          <w:rFonts w:ascii="Verdana" w:eastAsia="Times New Roman" w:hAnsi="Verdana" w:cs="Segoe UI"/>
-          <w:sz w:val="20"/>
-          <w:szCs w:val="20"/>
-        </w:rPr>
-        <w:t>FirstFloorSwitch</w:t>
-      </w:r>
-      <w:proofErr w:type="spellEnd"/>
-      <w:r>
-        <w:rPr>
-          <w:rFonts w:ascii="Verdana" w:eastAsia="Times New Roman" w:hAnsi="Verdana" w:cs="Segoe UI"/>
-          <w:sz w:val="20"/>
-          <w:szCs w:val="20"/>
-        </w:rPr>
-        <w:t xml:space="preserve">, and </w:t>
-      </w:r>
-      <w:proofErr w:type="spellStart"/>
-      <w:r>
-        <w:rPr>
-          <w:rFonts w:ascii="Verdana" w:eastAsia="Times New Roman" w:hAnsi="Verdana" w:cs="Segoe UI"/>
-          <w:sz w:val="20"/>
-          <w:szCs w:val="20"/>
-        </w:rPr>
-        <w:t>SecondFloorSwitch</w:t>
-      </w:r>
-      <w:proofErr w:type="spellEnd"/>
-      <w:r>
-        <w:rPr>
-          <w:rFonts w:ascii="Verdana" w:eastAsia="Times New Roman" w:hAnsi="Verdana" w:cs="Segoe UI"/>
-          <w:sz w:val="20"/>
-          <w:szCs w:val="20"/>
-        </w:rPr>
-        <w:t xml:space="preserve">) configured with 802.1q trunking to allow multiple VLANs to traverse a single </w:t>
-      </w:r>
-      <w:r>
-        <w:rPr>
-          <w:rFonts w:ascii="Verdana" w:eastAsia="Times New Roman" w:hAnsi="Verdana" w:cs="Segoe UI"/>
-          <w:sz w:val="20"/>
-          <w:szCs w:val="20"/>
-        </w:rPr>
-        <w:t>physical link</w:t>
-      </w:r>
-      <w:r>
-        <w:rPr>
-          <w:rFonts w:ascii="Verdana" w:eastAsia="Times New Roman" w:hAnsi="Verdana" w:cs="Segoe UI"/>
-          <w:sz w:val="20"/>
-          <w:szCs w:val="20"/>
-        </w:rPr>
-        <w:t xml:space="preserve">. </w:t>
-      </w:r>
-      <w:r>
-        <w:rPr>
           <w:rFonts w:ascii="Verdana" w:eastAsia="Times New Roman" w:hAnsi="Verdana" w:cs="Calibri"/>
           <w:sz w:val="24"/>
           <w:szCs w:val="24"/>
         </w:rPr>
+      </w:pPr>
+      <w:r>
+        <w:rPr>
+          <w:rFonts w:ascii="Verdana" w:eastAsia="Times New Roman" w:hAnsi="Verdana" w:cs="Segoe UI"/>
+          <w:sz w:val="20"/>
+          <w:szCs w:val="20"/>
+        </w:rPr>
+        <w:t xml:space="preserve">The topology utilizes </w:t>
+      </w:r>
+      <w:r>
+        <w:rPr>
+          <w:rFonts w:ascii="Verdana" w:eastAsia="Times New Roman" w:hAnsi="Verdana" w:cs="Segoe UI"/>
+          <w:b/>
+          <w:bCs/>
+          <w:sz w:val="20"/>
+          <w:szCs w:val="20"/>
+        </w:rPr>
+        <w:t>Open vSwitch</w:t>
+      </w:r>
+      <w:r>
+        <w:rPr>
+          <w:rFonts w:ascii="Verdana" w:eastAsia="Times New Roman" w:hAnsi="Verdana" w:cs="Segoe UI"/>
+          <w:sz w:val="20"/>
+          <w:szCs w:val="20"/>
+        </w:rPr>
+        <w:t xml:space="preserve"> instances (MainSwitch, </w:t>
+      </w:r>
+      <w:proofErr w:type="spellStart"/>
+      <w:r>
+        <w:rPr>
+          <w:rFonts w:ascii="Verdana" w:eastAsia="Times New Roman" w:hAnsi="Verdana" w:cs="Segoe UI"/>
+          <w:sz w:val="20"/>
+          <w:szCs w:val="20"/>
+        </w:rPr>
+        <w:t>FirstFloorSwitch</w:t>
+      </w:r>
+      <w:proofErr w:type="spellEnd"/>
+      <w:r>
+        <w:rPr>
+          <w:rFonts w:ascii="Verdana" w:eastAsia="Times New Roman" w:hAnsi="Verdana" w:cs="Segoe UI"/>
+          <w:sz w:val="20"/>
+          <w:szCs w:val="20"/>
+        </w:rPr>
+        <w:t xml:space="preserve">, and </w:t>
+      </w:r>
+      <w:proofErr w:type="spellStart"/>
+      <w:r>
+        <w:rPr>
+          <w:rFonts w:ascii="Verdana" w:eastAsia="Times New Roman" w:hAnsi="Verdana" w:cs="Segoe UI"/>
+          <w:sz w:val="20"/>
+          <w:szCs w:val="20"/>
+        </w:rPr>
+        <w:t>SecondFloorSwitch</w:t>
+      </w:r>
+      <w:proofErr w:type="spellEnd"/>
+      <w:r>
+        <w:rPr>
+          <w:rFonts w:ascii="Verdana" w:eastAsia="Times New Roman" w:hAnsi="Verdana" w:cs="Segoe UI"/>
+          <w:sz w:val="20"/>
+          <w:szCs w:val="20"/>
+        </w:rPr>
+        <w:t xml:space="preserve">) configured with 802.1q trunking to allow multiple VLANs to traverse a single physical link. </w:t>
+      </w:r>
+      <w:r>
+        <w:rPr>
+          <w:rFonts w:ascii="Verdana" w:eastAsia="Times New Roman" w:hAnsi="Verdana" w:cs="Calibri"/>
+          <w:sz w:val="24"/>
+          <w:szCs w:val="24"/>
+        </w:rPr>
         <w:t> </w:t>
       </w:r>
     </w:p>
@@ -1124,16 +1100,300 @@
         <w:spacing w:after="0" w:line="240" w:lineRule="auto"/>
         <w:textAlignment w:val="baseline"/>
         <w:rPr>
-          <w:rFonts w:ascii="Verdana" w:eastAsia="Times New Roman" w:hAnsi="Verdana" w:cs="Segoe UI"/>
-          <w:sz w:val="18"/>
-          <w:szCs w:val="18"/>
-        </w:rPr>
-      </w:pPr>
-      <w:r>
-        <w:rPr>
           <w:rFonts w:ascii="Verdana" w:eastAsia="Times New Roman" w:hAnsi="Verdana" w:cs="Calibri"/>
-        </w:rPr>
-        <w:t> </w:t>
+          <w:sz w:val="24"/>
+          <w:szCs w:val="24"/>
+        </w:rPr>
+      </w:pPr>
+    </w:p>
+    <w:p>
+      <w:pPr>
+        <w:spacing w:after="0" w:line="240" w:lineRule="auto"/>
+        <w:textAlignment w:val="baseline"/>
+        <w:rPr>
+          <w:rFonts w:ascii="Verdana" w:eastAsia="Times New Roman" w:hAnsi="Verdana" w:cs="Segoe UI"/>
+          <w:sz w:val="20"/>
+          <w:szCs w:val="20"/>
+        </w:rPr>
+      </w:pPr>
+      <w:r>
+        <w:rPr>
+          <w:rFonts w:ascii="Verdana" w:eastAsia="Times New Roman" w:hAnsi="Verdana" w:cs="Segoe UI"/>
+          <w:sz w:val="20"/>
+          <w:szCs w:val="20"/>
+        </w:rPr>
+        <w:drawing>
+          <wp:inline distT="0" distB="0" distL="0" distR="0" wp14:anchorId="1AB57E86" wp14:editId="2B7D6612">
+            <wp:extent cx="5943600" cy="2917190"/>
+            <wp:effectExtent l="0" t="0" r="0" b="0"/>
+            <wp:docPr id="1415341493" name="Picture 1"/>
+            <wp:cNvGraphicFramePr>
+              <a:graphicFrameLocks xmlns:a="http://schemas.openxmlformats.org/drawingml/2006/main" noChangeAspect="1"/>
+            </wp:cNvGraphicFramePr>
+            <a:graphic xmlns:a="http://schemas.openxmlformats.org/drawingml/2006/main">
+              <a:graphicData uri="http://schemas.openxmlformats.org/drawingml/2006/picture">
+                <pic:pic xmlns:pic="http://schemas.openxmlformats.org/drawingml/2006/picture">
+                  <pic:nvPicPr>
+                    <pic:cNvPr id="1415341493" name=""/>
+                    <pic:cNvPicPr/>
+                  </pic:nvPicPr>
+                  <pic:blipFill>
+                    <a:blip r:embed="rId12"/>
+                    <a:stretch>
+                      <a:fillRect/>
+                    </a:stretch>
+                  </pic:blipFill>
+                  <pic:spPr>
+                    <a:xfrm>
+                      <a:off x="0" y="0"/>
+                      <a:ext cx="5943600" cy="2917190"/>
+                    </a:xfrm>
+                    <a:prstGeom prst="rect">
+                      <a:avLst/>
+                    </a:prstGeom>
+                  </pic:spPr>
+                </pic:pic>
+              </a:graphicData>
+            </a:graphic>
+          </wp:inline>
+        </w:drawing>
+      </w:r>
+    </w:p>
+    <w:p>
+      <w:pPr>
+        <w:spacing w:after="0" w:line="240" w:lineRule="auto"/>
+        <w:textAlignment w:val="baseline"/>
+        <w:rPr>
+          <w:rFonts w:ascii="Verdana" w:eastAsia="Times New Roman" w:hAnsi="Verdana" w:cs="Segoe UI"/>
+          <w:sz w:val="20"/>
+          <w:szCs w:val="20"/>
+        </w:rPr>
+      </w:pPr>
+      <w:r>
+        <w:rPr>
+          <w:rFonts w:ascii="Verdana" w:eastAsia="Times New Roman" w:hAnsi="Verdana" w:cs="Segoe UI"/>
+          <w:sz w:val="20"/>
+          <w:szCs w:val="20"/>
+        </w:rPr>
+        <w:lastRenderedPageBreak/>
+        <w:drawing>
+          <wp:inline distT="0" distB="0" distL="0" distR="0" wp14:anchorId="526999DA" wp14:editId="38403323">
+            <wp:extent cx="3581900" cy="7173326"/>
+            <wp:effectExtent l="0" t="0" r="0" b="8890"/>
+            <wp:docPr id="1555306526" name="Picture 1"/>
+            <wp:cNvGraphicFramePr>
+              <a:graphicFrameLocks xmlns:a="http://schemas.openxmlformats.org/drawingml/2006/main" noChangeAspect="1"/>
+            </wp:cNvGraphicFramePr>
+            <a:graphic xmlns:a="http://schemas.openxmlformats.org/drawingml/2006/main">
+              <a:graphicData uri="http://schemas.openxmlformats.org/drawingml/2006/picture">
+                <pic:pic xmlns:pic="http://schemas.openxmlformats.org/drawingml/2006/picture">
+                  <pic:nvPicPr>
+                    <pic:cNvPr id="1555306526" name=""/>
+                    <pic:cNvPicPr/>
+                  </pic:nvPicPr>
+                  <pic:blipFill>
+                    <a:blip r:embed="rId13"/>
+                    <a:stretch>
+                      <a:fillRect/>
+                    </a:stretch>
+                  </pic:blipFill>
+                  <pic:spPr>
+                    <a:xfrm>
+                      <a:off x="0" y="0"/>
+                      <a:ext cx="3581900" cy="7173326"/>
+                    </a:xfrm>
+                    <a:prstGeom prst="rect">
+                      <a:avLst/>
+                    </a:prstGeom>
+                  </pic:spPr>
+                </pic:pic>
+              </a:graphicData>
+            </a:graphic>
+          </wp:inline>
+        </w:drawing>
+      </w:r>
+    </w:p>
+    <w:p>
+      <w:pPr>
+        <w:spacing w:after="0" w:line="240" w:lineRule="auto"/>
+        <w:textAlignment w:val="baseline"/>
+        <w:rPr>
+          <w:rFonts w:ascii="Verdana" w:eastAsia="Times New Roman" w:hAnsi="Verdana" w:cs="Segoe UI"/>
+          <w:sz w:val="18"/>
+          <w:szCs w:val="18"/>
+        </w:rPr>
+      </w:pPr>
+      <w:r>
+        <w:rPr>
+          <w:rFonts w:ascii="Verdana" w:eastAsia="Times New Roman" w:hAnsi="Verdana" w:cs="Segoe UI"/>
+          <w:sz w:val="18"/>
+          <w:szCs w:val="18"/>
+        </w:rPr>
+        <w:lastRenderedPageBreak/>
+        <w:drawing>
+          <wp:inline distT="0" distB="0" distL="0" distR="0" wp14:anchorId="31F77695" wp14:editId="59EF0E56">
+            <wp:extent cx="5943600" cy="3750310"/>
+            <wp:effectExtent l="0" t="0" r="0" b="2540"/>
+            <wp:docPr id="477909920" name="Picture 1"/>
+            <wp:cNvGraphicFramePr>
+              <a:graphicFrameLocks xmlns:a="http://schemas.openxmlformats.org/drawingml/2006/main" noChangeAspect="1"/>
+            </wp:cNvGraphicFramePr>
+            <a:graphic xmlns:a="http://schemas.openxmlformats.org/drawingml/2006/main">
+              <a:graphicData uri="http://schemas.openxmlformats.org/drawingml/2006/picture">
+                <pic:pic xmlns:pic="http://schemas.openxmlformats.org/drawingml/2006/picture">
+                  <pic:nvPicPr>
+                    <pic:cNvPr id="477909920" name=""/>
+                    <pic:cNvPicPr/>
+                  </pic:nvPicPr>
+                  <pic:blipFill>
+                    <a:blip r:embed="rId14"/>
+                    <a:stretch>
+                      <a:fillRect/>
+                    </a:stretch>
+                  </pic:blipFill>
+                  <pic:spPr>
+                    <a:xfrm>
+                      <a:off x="0" y="0"/>
+                      <a:ext cx="5943600" cy="3750310"/>
+                    </a:xfrm>
+                    <a:prstGeom prst="rect">
+                      <a:avLst/>
+                    </a:prstGeom>
+                  </pic:spPr>
+                </pic:pic>
+              </a:graphicData>
+            </a:graphic>
+          </wp:inline>
+        </w:drawing>
+      </w:r>
+    </w:p>
+    <w:p>
+      <w:pPr>
+        <w:spacing w:after="0" w:line="240" w:lineRule="auto"/>
+        <w:textAlignment w:val="baseline"/>
+        <w:rPr>
+          <w:rFonts w:ascii="Verdana" w:eastAsia="Times New Roman" w:hAnsi="Verdana" w:cs="Segoe UI"/>
+          <w:sz w:val="18"/>
+          <w:szCs w:val="18"/>
+        </w:rPr>
+      </w:pPr>
+    </w:p>
+    <w:p>
+      <w:pPr>
+        <w:spacing w:after="0" w:line="240" w:lineRule="auto"/>
+        <w:textAlignment w:val="baseline"/>
+        <w:rPr>
+          <w:rFonts w:ascii="Verdana" w:eastAsia="Times New Roman" w:hAnsi="Verdana" w:cs="Segoe UI"/>
+          <w:sz w:val="18"/>
+          <w:szCs w:val="18"/>
+        </w:rPr>
+      </w:pPr>
+      <w:r>
+        <w:rPr>
+          <w:rFonts w:ascii="Verdana" w:eastAsia="Times New Roman" w:hAnsi="Verdana" w:cs="Segoe UI"/>
+          <w:sz w:val="18"/>
+          <w:szCs w:val="18"/>
+        </w:rPr>
+        <w:drawing>
+          <wp:inline distT="0" distB="0" distL="0" distR="0" wp14:anchorId="5962CDAA" wp14:editId="04DF6E64">
+            <wp:extent cx="5943600" cy="4120515"/>
+            <wp:effectExtent l="0" t="0" r="0" b="0"/>
+            <wp:docPr id="1808734075" name="Picture 1"/>
+            <wp:cNvGraphicFramePr>
+              <a:graphicFrameLocks xmlns:a="http://schemas.openxmlformats.org/drawingml/2006/main" noChangeAspect="1"/>
+            </wp:cNvGraphicFramePr>
+            <a:graphic xmlns:a="http://schemas.openxmlformats.org/drawingml/2006/main">
+              <a:graphicData uri="http://schemas.openxmlformats.org/drawingml/2006/picture">
+                <pic:pic xmlns:pic="http://schemas.openxmlformats.org/drawingml/2006/picture">
+                  <pic:nvPicPr>
+                    <pic:cNvPr id="1808734075" name=""/>
+                    <pic:cNvPicPr/>
+                  </pic:nvPicPr>
+                  <pic:blipFill>
+                    <a:blip r:embed="rId15"/>
+                    <a:stretch>
+                      <a:fillRect/>
+                    </a:stretch>
+                  </pic:blipFill>
+                  <pic:spPr>
+                    <a:xfrm>
+                      <a:off x="0" y="0"/>
+                      <a:ext cx="5943600" cy="4120515"/>
+                    </a:xfrm>
+                    <a:prstGeom prst="rect">
+                      <a:avLst/>
+                    </a:prstGeom>
+                  </pic:spPr>
+                </pic:pic>
+              </a:graphicData>
+            </a:graphic>
+          </wp:inline>
+        </w:drawing>
+      </w:r>
+    </w:p>
+    <w:p>
+      <w:pPr>
+        <w:spacing w:after="0" w:line="240" w:lineRule="auto"/>
+        <w:textAlignment w:val="baseline"/>
+        <w:rPr>
+          <w:rFonts w:ascii="Verdana" w:eastAsia="Times New Roman" w:hAnsi="Verdana" w:cs="Segoe UI"/>
+          <w:sz w:val="18"/>
+          <w:szCs w:val="18"/>
+        </w:rPr>
+      </w:pPr>
+    </w:p>
+    <w:p>
+      <w:pPr>
+        <w:spacing w:after="0" w:line="240" w:lineRule="auto"/>
+        <w:textAlignment w:val="baseline"/>
+        <w:rPr>
+          <w:rFonts w:ascii="Verdana" w:eastAsia="Times New Roman" w:hAnsi="Verdana" w:cs="Segoe UI"/>
+          <w:sz w:val="18"/>
+          <w:szCs w:val="18"/>
+        </w:rPr>
+      </w:pPr>
+      <w:r>
+        <w:rPr>
+          <w:rFonts w:ascii="Verdana" w:eastAsia="Times New Roman" w:hAnsi="Verdana" w:cs="Segoe UI"/>
+          <w:sz w:val="18"/>
+          <w:szCs w:val="18"/>
+        </w:rPr>
+        <w:lastRenderedPageBreak/>
+        <w:drawing>
+          <wp:inline distT="0" distB="0" distL="0" distR="0" wp14:anchorId="1B125BEB" wp14:editId="2BAD0131">
+            <wp:extent cx="5943600" cy="4077335"/>
+            <wp:effectExtent l="0" t="0" r="0" b="0"/>
+            <wp:docPr id="1621720242" name="Picture 1"/>
+            <wp:cNvGraphicFramePr>
+              <a:graphicFrameLocks xmlns:a="http://schemas.openxmlformats.org/drawingml/2006/main" noChangeAspect="1"/>
+            </wp:cNvGraphicFramePr>
+            <a:graphic xmlns:a="http://schemas.openxmlformats.org/drawingml/2006/main">
+              <a:graphicData uri="http://schemas.openxmlformats.org/drawingml/2006/picture">
+                <pic:pic xmlns:pic="http://schemas.openxmlformats.org/drawingml/2006/picture">
+                  <pic:nvPicPr>
+                    <pic:cNvPr id="1621720242" name=""/>
+                    <pic:cNvPicPr/>
+                  </pic:nvPicPr>
+                  <pic:blipFill>
+                    <a:blip r:embed="rId16"/>
+                    <a:stretch>
+                      <a:fillRect/>
+                    </a:stretch>
+                  </pic:blipFill>
+                  <pic:spPr>
+                    <a:xfrm>
+                      <a:off x="0" y="0"/>
+                      <a:ext cx="5943600" cy="4077335"/>
+                    </a:xfrm>
+                    <a:prstGeom prst="rect">
+                      <a:avLst/>
+                    </a:prstGeom>
+                  </pic:spPr>
+                </pic:pic>
+              </a:graphicData>
+            </a:graphic>
+          </wp:inline>
+        </w:drawing>
       </w:r>
     </w:p>
     <w:p>
@@ -1589,6 +1849,7 @@
           <w:sz w:val="32"/>
           <w:szCs w:val="32"/>
         </w:rPr>
+        <w:lastRenderedPageBreak/>
         <w:br w:type="page"/>
       </w:r>
     </w:p>
@@ -1601,7 +1862,7 @@
           <w:szCs w:val="18"/>
         </w:rPr>
       </w:pPr>
-      <w:bookmarkStart w:id="1" w:name="_Hlk109889198"/>
+      <w:bookmarkStart w:id="0" w:name="_Hlk109889198"/>
       <w:r>
         <w:rPr>
           <w:rFonts w:ascii="Verdana" w:eastAsia="Times New Roman" w:hAnsi="Verdana"/>
@@ -1690,7 +1951,7 @@
         <w:t>Functionality </w:t>
       </w:r>
     </w:p>
-    <w:bookmarkEnd w:id="1"/>
+    <w:bookmarkEnd w:id="0"/>
     <w:p>
       <w:pPr>
         <w:spacing w:after="0" w:line="240" w:lineRule="auto"/>
@@ -4540,6 +4801,7 @@
           <w:sz w:val="20"/>
           <w:szCs w:val="20"/>
         </w:rPr>
+        <w:lastRenderedPageBreak/>
         <w:t xml:space="preserve">Deploy a </w:t>
       </w:r>
       <w:r>
@@ -4827,7 +5089,6 @@
           <w:szCs w:val="18"/>
         </w:rPr>
       </w:pPr>
-      <w:commentRangeStart w:id="2"/>
       <w:r>
         <w:rPr>
           <w:rFonts w:ascii="Verdana" w:eastAsia="Times New Roman" w:hAnsi="Verdana" w:cs="Segoe UI"/>
@@ -4927,13 +5188,6 @@
           <w:szCs w:val="20"/>
         </w:rPr>
         <w:t>address. You must also have at least one network resource that requires a static address.</w:t>
-      </w:r>
-      <w:commentRangeEnd w:id="2"/>
-      <w:r>
-        <w:rPr>
-          <w:rStyle w:val="CommentReference"/>
-        </w:rPr>
-        <w:commentReference w:id="2"/>
       </w:r>
       <w:r>
         <w:rPr>
@@ -5817,6 +6071,7 @@
           <w:sz w:val="20"/>
           <w:szCs w:val="20"/>
         </w:rPr>
+        <w:lastRenderedPageBreak/>
         <w:t xml:space="preserve">Log into the Cloud Server via RDP (if allowed by NSG) or Serial Console. </w:t>
       </w:r>
     </w:p>
@@ -6042,7 +6297,6 @@
           <w:szCs w:val="18"/>
         </w:rPr>
       </w:pPr>
-      <w:commentRangeStart w:id="3"/>
       <w:r>
         <w:rPr>
           <w:rFonts w:ascii="Verdana" w:eastAsia="Times New Roman" w:hAnsi="Verdana" w:cs="Segoe UI"/>
@@ -6112,13 +6366,6 @@
           <w:szCs w:val="20"/>
         </w:rPr>
         <w:t>on another network. Similarly, there must be devices on one network that cannot access resources on a different network.</w:t>
-      </w:r>
-      <w:commentRangeEnd w:id="3"/>
-      <w:r>
-        <w:rPr>
-          <w:rStyle w:val="CommentReference"/>
-        </w:rPr>
-        <w:commentReference w:id="3"/>
       </w:r>
     </w:p>
     <w:p>
@@ -6861,6 +7108,7 @@
           <w:sz w:val="20"/>
           <w:szCs w:val="20"/>
         </w:rPr>
+        <w:lastRenderedPageBreak/>
         <w:t xml:space="preserve">Navigate to the </w:t>
       </w:r>
       <w:r>
@@ -7233,7 +7481,6 @@
           <w:szCs w:val="18"/>
         </w:rPr>
       </w:pPr>
-      <w:commentRangeStart w:id="4"/>
       <w:r>
         <w:rPr>
           <w:rFonts w:ascii="Verdana" w:eastAsia="Times New Roman" w:hAnsi="Verdana" w:cs="Segoe UI"/>
@@ -7315,13 +7562,6 @@
           <w:szCs w:val="20"/>
         </w:rPr>
         <w:t>.</w:t>
-      </w:r>
-      <w:commentRangeEnd w:id="4"/>
-      <w:r>
-        <w:rPr>
-          <w:rStyle w:val="CommentReference"/>
-        </w:rPr>
-        <w:commentReference w:id="4"/>
       </w:r>
       <w:r>
         <w:rPr>
@@ -8096,6 +8336,7 @@
           <w:sz w:val="32"/>
           <w:szCs w:val="32"/>
         </w:rPr>
+        <w:lastRenderedPageBreak/>
         <w:t> </w:t>
       </w:r>
       <w:r>
@@ -8389,17 +8630,7 @@
           <w:sz w:val="20"/>
           <w:szCs w:val="20"/>
         </w:rPr>
-        <w:t>User-Defined</w:t>
-      </w:r>
-      <w:r>
-        <w:rPr>
-          <w:rFonts w:ascii="Verdana" w:eastAsia="Times New Roman" w:hAnsi="Verdana" w:cs="Segoe UI"/>
-          <w:b/>
-          <w:bCs/>
-          <w:sz w:val="20"/>
-          <w:szCs w:val="20"/>
-        </w:rPr>
-        <w:t xml:space="preserve"> Routes (UDRs)</w:t>
+        <w:t>User-Defined Routes (UDRs)</w:t>
       </w:r>
       <w:r>
         <w:rPr>
@@ -9270,10 +9501,10 @@
       </w:pPr>
     </w:p>
     <w:sectPr>
-      <w:headerReference w:type="default" r:id="rId16"/>
-      <w:footerReference w:type="default" r:id="rId17"/>
-      <w:headerReference w:type="first" r:id="rId18"/>
-      <w:footerReference w:type="first" r:id="rId19"/>
+      <w:headerReference w:type="default" r:id="rId17"/>
+      <w:footerReference w:type="default" r:id="rId18"/>
+      <w:headerReference w:type="first" r:id="rId19"/>
+      <w:footerReference w:type="first" r:id="rId20"/>
       <w:type w:val="continuous"/>
       <w:pgSz w:w="12240" w:h="15840"/>
       <w:pgMar w:top="1440" w:right="1440" w:bottom="1440" w:left="1440" w:header="720" w:footer="432" w:gutter="0"/>
@@ -9283,102 +9514,6 @@
     </w:sectPr>
   </w:body>
 </w:document>
-</file>
-
-<file path=word/comments.xml><?xml version="1.0" encoding="utf-8"?>
-<w:comments xmlns:wpc="http://schemas.microsoft.com/office/word/2010/wordprocessingCanvas" xmlns:cx="http://schemas.microsoft.com/office/drawing/2014/chartex" xmlns:cx1="http://schemas.microsoft.com/office/drawing/2015/9/8/chartex" xmlns:cx2="http://schemas.microsoft.com/office/drawing/2015/10/21/chartex" xmlns:cx3="http://schemas.microsoft.com/office/drawing/2016/5/9/chartex" xmlns:cx4="http://schemas.microsoft.com/office/drawing/2016/5/10/chartex" xmlns:cx5="http://schemas.microsoft.com/office/drawing/2016/5/11/chartex" xmlns:cx6="http://schemas.microsoft.com/office/drawing/2016/5/12/chartex" xmlns:cx7="http://schemas.microsoft.com/office/drawing/2016/5/13/chartex" xmlns:cx8="http://schemas.microsoft.com/office/drawing/2016/5/14/chartex" xmlns:mc="http://schemas.openxmlformats.org/markup-compatibility/2006" xmlns:aink="http://schemas.microsoft.com/office/drawing/2016/ink" xmlns:am3d="http://schemas.microsoft.com/office/drawing/2017/model3d" xmlns:o="urn:schemas-microsoft-com:office:office" xmlns:oel="http://schemas.microsoft.com/office/2019/extlst" xmlns:r="http://schemas.openxmlformats.org/officeDocument/2006/relationships" xmlns:m="http://schemas.openxmlformats.org/officeDocument/2006/math" xmlns:v="urn:schemas-microsoft-com:vml" xmlns:wp14="http://schemas.microsoft.com/office/word/2010/wordprocessingDrawing" xmlns:wp="http://schemas.openxmlformats.org/drawingml/2006/wordprocessingDrawing" xmlns:w10="urn:schemas-microsoft-com:office:word" xmlns:w="http://schemas.openxmlformats.org/wordprocessingml/2006/main" xmlns:w14="http://schemas.microsoft.com/office/word/2010/wordml" xmlns:w15="http://schemas.microsoft.com/office/word/2012/wordml" xmlns:w16cex="http://schemas.microsoft.com/office/word/2018/wordml/cex" xmlns:w16cid="http://schemas.microsoft.com/office/word/2016/wordml/cid" xmlns:w16="http://schemas.microsoft.com/office/word/2018/wordml" xmlns:w16du="http://schemas.microsoft.com/office/word/2023/wordml/word16du" xmlns:w16sdtdh="http://schemas.microsoft.com/office/word/2020/wordml/sdtdatahash" xmlns:w16sdtfl="http://schemas.microsoft.com/office/word/2024/wordml/sdtformatlock" xmlns:w16se="http://schemas.microsoft.com/office/word/2015/wordml/symex" xmlns:wpg="http://schemas.microsoft.com/office/word/2010/wordprocessingGroup" xmlns:wpi="http://schemas.microsoft.com/office/word/2010/wordprocessingInk" xmlns:wne="http://schemas.microsoft.com/office/word/2006/wordml" xmlns:wps="http://schemas.microsoft.com/office/word/2010/wordprocessingShape" mc:Ignorable="w14 w15 w16se w16cid w16 w16cex w16sdtdh w16sdtfl w16du wp14">
-  <w:comment w:id="0" w:author="Jeff Davis" w:date="2025-04-17T20:06:00Z" w:initials="JD">
-    <w:p>
-      <w:pPr>
-        <w:pStyle w:val="CommentText"/>
-      </w:pPr>
-      <w:r>
-        <w:rPr>
-          <w:rStyle w:val="CommentReference"/>
-        </w:rPr>
-        <w:annotationRef/>
-      </w:r>
-      <w:r>
-        <w:t>my thoughts:  Explain how you're using VLANs to create separate network lanes for each department or service at the switching level (Layer 2) to boost security and reduce congestion, while using trunking to let this separated traffic move between switches. For each setup, describe your configuration choices and how you verified that the network segments are isolated and that any allowed communication works correctly, using proper VLAN terminology. We will validate this through local, cloud, and hybrid network tests.</w:t>
-      </w:r>
-    </w:p>
-  </w:comment>
-  <w:comment w:id="2" w:author="Jeff Davis" w:date="2025-04-17T20:18:00Z" w:initials="JD">
-    <w:p>
-      <w:pPr>
-        <w:pStyle w:val="CommentText"/>
-      </w:pPr>
-      <w:r>
-        <w:rPr>
-          <w:rStyle w:val="CommentReference"/>
-        </w:rPr>
-        <w:annotationRef/>
-      </w:r>
-      <w:r>
-        <w:t>my thoughts: Within your AWS VPC or Azure VNet, most network resources should utilize dynamically assigned IP addresses provided by the respective cloud platform's DHCP service. You must identify and configure at least one network resource that necessitates a static IP address within your chosen cloud environment. You will need to demonstrate how to reserve and assign this static IP address to the designated resource.</w:t>
-      </w:r>
-    </w:p>
-  </w:comment>
-  <w:comment w:id="3" w:author="Jeff Davis" w:date="2025-04-17T20:26:00Z" w:initials="JD">
-    <w:p>
-      <w:pPr>
-        <w:pStyle w:val="CommentText"/>
-      </w:pPr>
-      <w:r>
-        <w:rPr>
-          <w:rStyle w:val="CommentReference"/>
-        </w:rPr>
-        <w:annotationRef/>
-      </w:r>
-      <w:r>
-        <w:t>my thoughts: Within your chosen cloud environment (AWS or Azure), you will create a network architecture comprising at least two separate subnets. The objective is to show your ability to control network reachability between these segments using cloud-native access control features. Your configuration must allow a designated device on one subnet to successfully access specific resources on a device in a different subnet. You must also demonstrate that another designated device on one subnet is blocked from accessing specific resources on a device in a different subnet.</w:t>
-      </w:r>
-    </w:p>
-  </w:comment>
-  <w:comment w:id="4" w:author="Jeff Davis" w:date="2025-04-17T20:32:00Z" w:initials="JD">
-    <w:p>
-      <w:pPr>
-        <w:pStyle w:val="CommentText"/>
-      </w:pPr>
-      <w:r>
-        <w:rPr>
-          <w:rStyle w:val="CommentReference"/>
-        </w:rPr>
-        <w:annotationRef/>
-      </w:r>
-      <w:r>
-        <w:t>my thoughts: Your custom test case will focus on creating a secure VPN connection that bridges a simulated network with your cloud environment (AWS or Azure). This test should be driven by a specific organizational need or opportunity identified earlier. You must demonstrate the successful configuration of a VPN solution and verify bidirectional network communication. This verification should include successfully pinging or establishing a simple TCP connection between a designated resource in your local network and a designated resource within your cloud environment. The scope and requirements of this test should align with the predefined test cases, emphasizing the establishment and basic functionality of the hybrid VPN link.</w:t>
-      </w:r>
-    </w:p>
-  </w:comment>
-</w:comments>
-</file>
-
-<file path=word/commentsExtended.xml><?xml version="1.0" encoding="utf-8"?>
-<w15:commentsEx xmlns:wpc="http://schemas.microsoft.com/office/word/2010/wordprocessingCanvas" xmlns:cx="http://schemas.microsoft.com/office/drawing/2014/chartex" xmlns:cx1="http://schemas.microsoft.com/office/drawing/2015/9/8/chartex" xmlns:cx2="http://schemas.microsoft.com/office/drawing/2015/10/21/chartex" xmlns:cx3="http://schemas.microsoft.com/office/drawing/2016/5/9/chartex" xmlns:cx4="http://schemas.microsoft.com/office/drawing/2016/5/10/chartex" xmlns:cx5="http://schemas.microsoft.com/office/drawing/2016/5/11/chartex" xmlns:cx6="http://schemas.microsoft.com/office/drawing/2016/5/12/chartex" xmlns:cx7="http://schemas.microsoft.com/office/drawing/2016/5/13/chartex" xmlns:cx8="http://schemas.microsoft.com/office/drawing/2016/5/14/chartex" xmlns:mc="http://schemas.openxmlformats.org/markup-compatibility/2006" xmlns:aink="http://schemas.microsoft.com/office/drawing/2016/ink" xmlns:am3d="http://schemas.microsoft.com/office/drawing/2017/model3d" xmlns:o="urn:schemas-microsoft-com:office:office" xmlns:oel="http://schemas.microsoft.com/office/2019/extlst" xmlns:r="http://schemas.openxmlformats.org/officeDocument/2006/relationships" xmlns:m="http://schemas.openxmlformats.org/officeDocument/2006/math" xmlns:v="urn:schemas-microsoft-com:vml" xmlns:wp14="http://schemas.microsoft.com/office/word/2010/wordprocessingDrawing" xmlns:wp="http://schemas.openxmlformats.org/drawingml/2006/wordprocessingDrawing" xmlns:w10="urn:schemas-microsoft-com:office:word" xmlns:w="http://schemas.openxmlformats.org/wordprocessingml/2006/main" xmlns:w14="http://schemas.microsoft.com/office/word/2010/wordml" xmlns:w15="http://schemas.microsoft.com/office/word/2012/wordml" xmlns:w16cex="http://schemas.microsoft.com/office/word/2018/wordml/cex" xmlns:w16cid="http://schemas.microsoft.com/office/word/2016/wordml/cid" xmlns:w16="http://schemas.microsoft.com/office/word/2018/wordml" xmlns:w16du="http://schemas.microsoft.com/office/word/2023/wordml/word16du" xmlns:w16sdtdh="http://schemas.microsoft.com/office/word/2020/wordml/sdtdatahash" xmlns:w16sdtfl="http://schemas.microsoft.com/office/word/2024/wordml/sdtformatlock" xmlns:w16se="http://schemas.microsoft.com/office/word/2015/wordml/symex" xmlns:wpg="http://schemas.microsoft.com/office/word/2010/wordprocessingGroup" xmlns:wpi="http://schemas.microsoft.com/office/word/2010/wordprocessingInk" xmlns:wne="http://schemas.microsoft.com/office/word/2006/wordml" xmlns:wps="http://schemas.microsoft.com/office/word/2010/wordprocessingShape" mc:Ignorable="w14 w15 w16se w16cid w16 w16cex w16sdtdh w16sdtfl w16du wp14">
-  <w15:commentEx w15:paraId="0A8726AF" w15:done="1"/>
-  <w15:commentEx w15:paraId="06BD18CF" w15:done="1"/>
-  <w15:commentEx w15:paraId="5F2CDD78" w15:done="1"/>
-  <w15:commentEx w15:paraId="09C3405D" w15:done="1"/>
-</w15:commentsEx>
-</file>
-
-<file path=word/commentsExtensible.xml><?xml version="1.0" encoding="utf-8"?>
-<w16cex:commentsExtensible xmlns:wpc="http://schemas.microsoft.com/office/word/2010/wordprocessingCanvas" xmlns:cx="http://schemas.microsoft.com/office/drawing/2014/chartex" xmlns:cx1="http://schemas.microsoft.com/office/drawing/2015/9/8/chartex" xmlns:cx2="http://schemas.microsoft.com/office/drawing/2015/10/21/chartex" xmlns:cx3="http://schemas.microsoft.com/office/drawing/2016/5/9/chartex" xmlns:cx4="http://schemas.microsoft.com/office/drawing/2016/5/10/chartex" xmlns:cx5="http://schemas.microsoft.com/office/drawing/2016/5/11/chartex" xmlns:cx6="http://schemas.microsoft.com/office/drawing/2016/5/12/chartex" xmlns:cx7="http://schemas.microsoft.com/office/drawing/2016/5/13/chartex" xmlns:cx8="http://schemas.microsoft.com/office/drawing/2016/5/14/chartex" xmlns:cr="http://schemas.microsoft.com/office/comments/2020/reactions" xmlns:mc="http://schemas.openxmlformats.org/markup-compatibility/2006" xmlns:aink="http://schemas.microsoft.com/office/drawing/2016/ink" xmlns:am3d="http://schemas.microsoft.com/office/drawing/2017/model3d" xmlns:o="urn:schemas-microsoft-com:office:office" xmlns:oel="http://schemas.microsoft.com/office/2019/extlst" xmlns:r="http://schemas.openxmlformats.org/officeDocument/2006/relationships" xmlns:m="http://schemas.openxmlformats.org/officeDocument/2006/math" xmlns:v="urn:schemas-microsoft-com:vml" xmlns:wp14="http://schemas.microsoft.com/office/word/2010/wordprocessingDrawing" xmlns:wp="http://schemas.openxmlformats.org/drawingml/2006/wordprocessingDrawing" xmlns:w10="urn:schemas-microsoft-com:office:word" xmlns:w="http://schemas.openxmlformats.org/wordprocessingml/2006/main" xmlns:w14="http://schemas.microsoft.com/office/word/2010/wordml" xmlns:w15="http://schemas.microsoft.com/office/word/2012/wordml" xmlns:w16cex="http://schemas.microsoft.com/office/word/2018/wordml/cex" xmlns:w16cid="http://schemas.microsoft.com/office/word/2016/wordml/cid" xmlns:w16="http://schemas.microsoft.com/office/word/2018/wordml" xmlns:w16du="http://schemas.microsoft.com/office/word/2023/wordml/word16du" xmlns:w16sdtdh="http://schemas.microsoft.com/office/word/2020/wordml/sdtdatahash" xmlns:w16sdtfl="http://schemas.microsoft.com/office/word/2024/wordml/sdtformatlock" xmlns:w16se="http://schemas.microsoft.com/office/word/2015/wordml/symex" xmlns:wpg="http://schemas.microsoft.com/office/word/2010/wordprocessingGroup" xmlns:wpi="http://schemas.microsoft.com/office/word/2010/wordprocessingInk" xmlns:wne="http://schemas.microsoft.com/office/word/2006/wordml" xmlns:wps="http://schemas.microsoft.com/office/word/2010/wordprocessingShape" mc:Ignorable="w14 w15 w16se w16cid w16 w16cex w16sdtdh w16sdtfl cr w16du wp14">
-  <w16cex:commentExtensible w16cex:durableId="683F31B2" w16cex:dateUtc="2025-04-18T01:06:00Z"/>
-  <w16cex:commentExtensible w16cex:durableId="6A1132F7" w16cex:dateUtc="2025-04-18T01:18:00Z"/>
-  <w16cex:commentExtensible w16cex:durableId="0DB65B76" w16cex:dateUtc="2025-04-18T01:26:00Z"/>
-  <w16cex:commentExtensible w16cex:durableId="634D55D8" w16cex:dateUtc="2025-04-18T01:32:00Z"/>
-</w16cex:commentsExtensible>
-</file>
-
-<file path=word/commentsIds.xml><?xml version="1.0" encoding="utf-8"?>
-<w16cid:commentsIds xmlns:wpc="http://schemas.microsoft.com/office/word/2010/wordprocessingCanvas" xmlns:cx="http://schemas.microsoft.com/office/drawing/2014/chartex" xmlns:cx1="http://schemas.microsoft.com/office/drawing/2015/9/8/chartex" xmlns:cx2="http://schemas.microsoft.com/office/drawing/2015/10/21/chartex" xmlns:cx3="http://schemas.microsoft.com/office/drawing/2016/5/9/chartex" xmlns:cx4="http://schemas.microsoft.com/office/drawing/2016/5/10/chartex" xmlns:cx5="http://schemas.microsoft.com/office/drawing/2016/5/11/chartex" xmlns:cx6="http://schemas.microsoft.com/office/drawing/2016/5/12/chartex" xmlns:cx7="http://schemas.microsoft.com/office/drawing/2016/5/13/chartex" xmlns:cx8="http://schemas.microsoft.com/office/drawing/2016/5/14/chartex" xmlns:mc="http://schemas.openxmlformats.org/markup-compatibility/2006" xmlns:aink="http://schemas.microsoft.com/office/drawing/2016/ink" xmlns:am3d="http://schemas.microsoft.com/office/drawing/2017/model3d" xmlns:o="urn:schemas-microsoft-com:office:office" xmlns:oel="http://schemas.microsoft.com/office/2019/extlst" xmlns:r="http://schemas.openxmlformats.org/officeDocument/2006/relationships" xmlns:m="http://schemas.openxmlformats.org/officeDocument/2006/math" xmlns:v="urn:schemas-microsoft-com:vml" xmlns:wp14="http://schemas.microsoft.com/office/word/2010/wordprocessingDrawing" xmlns:wp="http://schemas.openxmlformats.org/drawingml/2006/wordprocessingDrawing" xmlns:w10="urn:schemas-microsoft-com:office:word" xmlns:w="http://schemas.openxmlformats.org/wordprocessingml/2006/main" xmlns:w14="http://schemas.microsoft.com/office/word/2010/wordml" xmlns:w15="http://schemas.microsoft.com/office/word/2012/wordml" xmlns:w16cex="http://schemas.microsoft.com/office/word/2018/wordml/cex" xmlns:w16cid="http://schemas.microsoft.com/office/word/2016/wordml/cid" xmlns:w16="http://schemas.microsoft.com/office/word/2018/wordml" xmlns:w16du="http://schemas.microsoft.com/office/word/2023/wordml/word16du" xmlns:w16sdtdh="http://schemas.microsoft.com/office/word/2020/wordml/sdtdatahash" xmlns:w16sdtfl="http://schemas.microsoft.com/office/word/2024/wordml/sdtformatlock" xmlns:w16se="http://schemas.microsoft.com/office/word/2015/wordml/symex" xmlns:wpg="http://schemas.microsoft.com/office/word/2010/wordprocessingGroup" xmlns:wpi="http://schemas.microsoft.com/office/word/2010/wordprocessingInk" xmlns:wne="http://schemas.microsoft.com/office/word/2006/wordml" xmlns:wps="http://schemas.microsoft.com/office/word/2010/wordprocessingShape" mc:Ignorable="w14 w15 w16se w16cid w16 w16cex w16sdtdh w16sdtfl w16du wp14">
-  <w16cid:commentId w16cid:paraId="0A8726AF" w16cid:durableId="683F31B2"/>
-  <w16cid:commentId w16cid:paraId="06BD18CF" w16cid:durableId="6A1132F7"/>
-  <w16cid:commentId w16cid:paraId="5F2CDD78" w16cid:durableId="0DB65B76"/>
-  <w16cid:commentId w16cid:paraId="09C3405D" w16cid:durableId="634D55D8"/>
-</w16cid:commentsIds>
 </file>
 
 <file path=word/endnotes.xml><?xml version="1.0" encoding="utf-8"?>
@@ -12841,14 +12976,6 @@
     <w:abstractNumId w:val="0"/>
   </w:num>
 </w:numbering>
-</file>
-
-<file path=word/people.xml><?xml version="1.0" encoding="utf-8"?>
-<w15:people xmlns:wpc="http://schemas.microsoft.com/office/word/2010/wordprocessingCanvas" xmlns:cx="http://schemas.microsoft.com/office/drawing/2014/chartex" xmlns:cx1="http://schemas.microsoft.com/office/drawing/2015/9/8/chartex" xmlns:cx2="http://schemas.microsoft.com/office/drawing/2015/10/21/chartex" xmlns:cx3="http://schemas.microsoft.com/office/drawing/2016/5/9/chartex" xmlns:cx4="http://schemas.microsoft.com/office/drawing/2016/5/10/chartex" xmlns:cx5="http://schemas.microsoft.com/office/drawing/2016/5/11/chartex" xmlns:cx6="http://schemas.microsoft.com/office/drawing/2016/5/12/chartex" xmlns:cx7="http://schemas.microsoft.com/office/drawing/2016/5/13/chartex" xmlns:cx8="http://schemas.microsoft.com/office/drawing/2016/5/14/chartex" xmlns:mc="http://schemas.openxmlformats.org/markup-compatibility/2006" xmlns:aink="http://schemas.microsoft.com/office/drawing/2016/ink" xmlns:am3d="http://schemas.microsoft.com/office/drawing/2017/model3d" xmlns:o="urn:schemas-microsoft-com:office:office" xmlns:oel="http://schemas.microsoft.com/office/2019/extlst" xmlns:r="http://schemas.openxmlformats.org/officeDocument/2006/relationships" xmlns:m="http://schemas.openxmlformats.org/officeDocument/2006/math" xmlns:v="urn:schemas-microsoft-com:vml" xmlns:wp14="http://schemas.microsoft.com/office/word/2010/wordprocessingDrawing" xmlns:wp="http://schemas.openxmlformats.org/drawingml/2006/wordprocessingDrawing" xmlns:w10="urn:schemas-microsoft-com:office:word" xmlns:w="http://schemas.openxmlformats.org/wordprocessingml/2006/main" xmlns:w14="http://schemas.microsoft.com/office/word/2010/wordml" xmlns:w15="http://schemas.microsoft.com/office/word/2012/wordml" xmlns:w16cex="http://schemas.microsoft.com/office/word/2018/wordml/cex" xmlns:w16cid="http://schemas.microsoft.com/office/word/2016/wordml/cid" xmlns:w16="http://schemas.microsoft.com/office/word/2018/wordml" xmlns:w16du="http://schemas.microsoft.com/office/word/2023/wordml/word16du" xmlns:w16sdtdh="http://schemas.microsoft.com/office/word/2020/wordml/sdtdatahash" xmlns:w16sdtfl="http://schemas.microsoft.com/office/word/2024/wordml/sdtformatlock" xmlns:w16se="http://schemas.microsoft.com/office/word/2015/wordml/symex" xmlns:wpg="http://schemas.microsoft.com/office/word/2010/wordprocessingGroup" xmlns:wpi="http://schemas.microsoft.com/office/word/2010/wordprocessingInk" xmlns:wne="http://schemas.microsoft.com/office/word/2006/wordml" xmlns:wps="http://schemas.microsoft.com/office/word/2010/wordprocessingShape" mc:Ignorable="w14 w15 w16se w16cid w16 w16cex w16sdtdh w16sdtfl w16du wp14">
-  <w15:person w15:author="Jeff Davis">
-    <w15:presenceInfo w15:providerId="AD" w15:userId="S::jeff.davis@wgu.edu::7fd837f9-9474-4e89-86a1-e221ab8df538"/>
-  </w15:person>
-</w15:people>
 </file>
 
 <file path=word/styles.xml><?xml version="1.0" encoding="utf-8"?>
@@ -13319,6 +13446,7 @@
   <w:style w:type="character" w:default="1" w:styleId="DefaultParagraphFont">
     <w:name w:val="Default Paragraph Font"/>
     <w:uiPriority w:val="1"/>
+    <w:semiHidden/>
     <w:unhideWhenUsed/>
   </w:style>
   <w:style w:type="table" w:default="1" w:styleId="TableNormal">
@@ -13832,6 +13960,10 @@
 </file>
 
 <file path=customXml/item2.xml><?xml version="1.0" encoding="utf-8"?>
+<b:Sources xmlns:b="http://schemas.openxmlformats.org/officeDocument/2006/bibliography" xmlns="http://schemas.openxmlformats.org/officeDocument/2006/bibliography" SelectedStyle="\APASixthEditionOfficeOnline.xsl" StyleName="APA" Version="6"/>
+</file>
+
+<file path=customXml/item3.xml><?xml version="1.0" encoding="utf-8"?>
 <?mso-contentType ?>
 <FormTemplates xmlns="http://schemas.microsoft.com/sharepoint/v3/contenttype/forms">
   <Display>DocumentLibraryForm</Display>
@@ -13840,22 +13972,7 @@
 </FormTemplates>
 </file>
 
-<file path=customXml/item3.xml><?xml version="1.0" encoding="utf-8"?>
-<b:Sources xmlns:b="http://schemas.openxmlformats.org/officeDocument/2006/bibliography" xmlns="http://schemas.openxmlformats.org/officeDocument/2006/bibliography" SelectedStyle="\APASixthEditionOfficeOnline.xsl" StyleName="APA" Version="6"/>
-</file>
-
 <file path=customXml/item4.xml><?xml version="1.0" encoding="utf-8"?>
-<p:properties xmlns:p="http://schemas.microsoft.com/office/2006/metadata/properties" xmlns:xsi="http://www.w3.org/2001/XMLSchema-instance" xmlns:pc="http://schemas.microsoft.com/office/infopath/2007/PartnerControls">
-  <documentManagement>
-    <lcf76f155ced4ddcb4097134ff3c332f xmlns="8cb223eb-8fc9-43bb-896c-9785dfdd840e">
-      <Terms xmlns="http://schemas.microsoft.com/office/infopath/2007/PartnerControls"/>
-    </lcf76f155ced4ddcb4097134ff3c332f>
-    <TaxCatchAll xmlns="530517bb-b50c-4599-82d9-b1a16adffa97" xsi:nil="true"/>
-  </documentManagement>
-</p:properties>
-</file>
-
-<file path=customXml/item5.xml><?xml version="1.0" encoding="utf-8"?>
 <ct:contentTypeSchema xmlns:ct="http://schemas.microsoft.com/office/2006/metadata/contentType" xmlns:ma="http://schemas.microsoft.com/office/2006/metadata/properties/metaAttributes" ct:_="" ma:_="" ma:contentTypeName="Document" ma:contentTypeID="0x0101006E2604F785F3404D9994F55486916505" ma:contentTypeVersion="9" ma:contentTypeDescription="Create a new document." ma:contentTypeScope="" ma:versionID="f8332895e037df1aba1087d622acc727">
   <xsd:schema xmlns:xsd="http://www.w3.org/2001/XMLSchema" xmlns:xs="http://www.w3.org/2001/XMLSchema" xmlns:p="http://schemas.microsoft.com/office/2006/metadata/properties" xmlns:ns2="8cb223eb-8fc9-43bb-896c-9785dfdd840e" xmlns:ns3="530517bb-b50c-4599-82d9-b1a16adffa97" targetNamespace="http://schemas.microsoft.com/office/2006/metadata/properties" ma:root="true" ma:fieldsID="c99d5cfa90593929f019df6418f1ae2f" ns2:_="" ns3:_="">
     <xsd:import namespace="8cb223eb-8fc9-43bb-896c-9785dfdd840e"/>
@@ -14050,6 +14167,17 @@
 </ct:contentTypeSchema>
 </file>
 
+<file path=customXml/item5.xml><?xml version="1.0" encoding="utf-8"?>
+<p:properties xmlns:p="http://schemas.microsoft.com/office/2006/metadata/properties" xmlns:xsi="http://www.w3.org/2001/XMLSchema-instance" xmlns:pc="http://schemas.microsoft.com/office/infopath/2007/PartnerControls">
+  <documentManagement>
+    <lcf76f155ced4ddcb4097134ff3c332f xmlns="8cb223eb-8fc9-43bb-896c-9785dfdd840e">
+      <Terms xmlns="http://schemas.microsoft.com/office/infopath/2007/PartnerControls"/>
+    </lcf76f155ced4ddcb4097134ff3c332f>
+    <TaxCatchAll xmlns="530517bb-b50c-4599-82d9-b1a16adffa97" xsi:nil="true"/>
+  </documentManagement>
+</p:properties>
+</file>
+
 <file path=customXml/itemProps1.xml><?xml version="1.0" encoding="utf-8"?>
 <ds:datastoreItem xmlns:ds="http://schemas.openxmlformats.org/officeDocument/2006/customXml" ds:itemID="{55AF091B-3C7A-41E3-B477-F2FDAA23CFDA}">
   <ds:schemaRefs>
@@ -14059,6 +14187,14 @@
 </file>
 
 <file path=customXml/itemProps2.xml><?xml version="1.0" encoding="utf-8"?>
+<ds:datastoreItem xmlns:ds="http://schemas.openxmlformats.org/officeDocument/2006/customXml" ds:itemID="{1B6B35DE-0877-4E66-80B1-D9587151751D}">
+  <ds:schemaRefs>
+    <ds:schemaRef ds:uri="http://schemas.openxmlformats.org/officeDocument/2006/bibliography"/>
+  </ds:schemaRefs>
+</ds:datastoreItem>
+</file>
+
+<file path=customXml/itemProps3.xml><?xml version="1.0" encoding="utf-8"?>
 <ds:datastoreItem xmlns:ds="http://schemas.openxmlformats.org/officeDocument/2006/customXml" ds:itemID="{C6552677-A95B-4093-849B-B6AED615DA4B}">
   <ds:schemaRefs>
     <ds:schemaRef ds:uri="http://schemas.microsoft.com/sharepoint/v3/contenttype/forms"/>
@@ -14066,26 +14202,7 @@
 </ds:datastoreItem>
 </file>
 
-<file path=customXml/itemProps3.xml><?xml version="1.0" encoding="utf-8"?>
-<ds:datastoreItem xmlns:ds="http://schemas.openxmlformats.org/officeDocument/2006/customXml" ds:itemID="{1B6B35DE-0877-4E66-80B1-D9587151751D}">
-  <ds:schemaRefs>
-    <ds:schemaRef ds:uri="http://schemas.openxmlformats.org/officeDocument/2006/bibliography"/>
-  </ds:schemaRefs>
-</ds:datastoreItem>
-</file>
-
 <file path=customXml/itemProps4.xml><?xml version="1.0" encoding="utf-8"?>
-<ds:datastoreItem xmlns:ds="http://schemas.openxmlformats.org/officeDocument/2006/customXml" ds:itemID="{E23E4120-D6A2-4237-8072-707FB1C50E55}">
-  <ds:schemaRefs>
-    <ds:schemaRef ds:uri="http://schemas.microsoft.com/office/2006/metadata/properties"/>
-    <ds:schemaRef ds:uri="http://schemas.microsoft.com/office/infopath/2007/PartnerControls"/>
-    <ds:schemaRef ds:uri="8cb223eb-8fc9-43bb-896c-9785dfdd840e"/>
-    <ds:schemaRef ds:uri="530517bb-b50c-4599-82d9-b1a16adffa97"/>
-  </ds:schemaRefs>
-</ds:datastoreItem>
-</file>
-
-<file path=customXml/itemProps5.xml><?xml version="1.0" encoding="utf-8"?>
 <ds:datastoreItem xmlns:ds="http://schemas.openxmlformats.org/officeDocument/2006/customXml" ds:itemID="{CCCC9AE2-3E56-4C20-AC29-05191EC5D07B}">
   <ds:schemaRefs>
     <ds:schemaRef ds:uri="http://schemas.microsoft.com/office/2006/metadata/contentType"/>
@@ -14104,6 +14221,17 @@
 </ds:datastoreItem>
 </file>
 
+<file path=customXml/itemProps5.xml><?xml version="1.0" encoding="utf-8"?>
+<ds:datastoreItem xmlns:ds="http://schemas.openxmlformats.org/officeDocument/2006/customXml" ds:itemID="{E23E4120-D6A2-4237-8072-707FB1C50E55}">
+  <ds:schemaRefs>
+    <ds:schemaRef ds:uri="http://schemas.microsoft.com/office/2006/metadata/properties"/>
+    <ds:schemaRef ds:uri="http://schemas.microsoft.com/office/infopath/2007/PartnerControls"/>
+    <ds:schemaRef ds:uri="8cb223eb-8fc9-43bb-896c-9785dfdd840e"/>
+    <ds:schemaRef ds:uri="530517bb-b50c-4599-82d9-b1a16adffa97"/>
+  </ds:schemaRefs>
+</ds:datastoreItem>
+</file>
+
 <file path=docMetadata/LabelInfo.xml><?xml version="1.0" encoding="utf-8"?>
 <clbl:labelList xmlns:clbl="http://schemas.microsoft.com/office/2020/mipLabelMetadata">
   <clbl:label id="{5d77a346-bc3d-4f52-ada3-85cfab5578fe}" enabled="0" method="" siteId="{5d77a346-bc3d-4f52-ada3-85cfab5578fe}" removed="1"/>

</xml_diff>